<commit_message>
docs: cite public sources and label every claim in the project report
Adds independent evidence (Prothom Alo, The Daily Star, The Business Standard,
The Financial Express, upay, IFC) with a reference list, a validation-of-claims
section, and records the 2026 Eid date discrepancy and the unconfirmed
commission rates in DATA_ASSUMPTIONS.

Co-Authored-By: Claude Opus 5.5 <noreply@anthropic.com>
Claude-Session: https://claude.ai/code/session_019EbryXVXrrp1iHTHugb3FH
</commit_message>
<xml_diff>
--- a/docs/report/FloatWise_Project_Report.docx
+++ b/docs/report/FloatWise_Project_Report.docx
@@ -103,7 +103,7 @@
         </w:rPr>
         <w:t xml:space="preserve">Repository: </w:t>
       </w:r>
-      <w:hyperlink w:history="1" r:id="rIdk2tzbmwa2utnuhzu30iix">
+      <w:hyperlink w:history="1" r:id="rIdjhr_jwq7acjgu6dwxuqhu">
         <w:r>
           <w:rPr>
             <w:rStyle w:val="Hyperlink"/>
@@ -1376,6 +1376,31 @@
         <w:spacing w:after="60"/>
       </w:pPr>
     </w:p>
+    <w:p>
+      <w:pPr>
+        <w:spacing w:after="120" w:line="288"/>
+      </w:pPr>
+      <w:r>
+        <w:rPr>
+          <w:b/>
+          <w:bCs/>
+        </w:rPr>
+        <w:t xml:space="preserve">How to read the evidence.</w:t>
+      </w:r>
+      <w:r>
+        <w:t xml:space="preserve"> Facts about Bangladesh, MFS and upay are checked against independent public sources (Prothom Alo, The Daily Star, The Business Standard, The Financial Express, upay's own website, IFC/World Bank); numbers in square brackets point to the reference list in Appendix C. All results (forecast accuracy, backtest, business value) come from our own code on </w:t>
+      </w:r>
+      <w:r>
+        <w:rPr>
+          <w:b/>
+          <w:bCs/>
+        </w:rPr>
+        <w:t xml:space="preserve">synthetic</w:t>
+      </w:r>
+      <w:r>
+        <w:t xml:space="preserve"> data: they are reproducible and tested, but not yet validated on real upay data. Section 15 lists every claim with its status, including one discrepancy we found.</w:t>
+      </w:r>
+    </w:p>
     <w:tbl>
       <w:tblPr>
         <w:tblW w:type="dxa" w:w="9026"/>
@@ -1392,6 +1417,9 @@
         <w:gridCol w:w="9026"/>
       </w:tblGrid>
       <w:tr>
+        <w:trPr>
+          <w:cantSplit/>
+        </w:trPr>
         <w:tc>
           <w:tcPr>
             <w:tcW w:type="dxa" w:w="9026"/>
@@ -1449,7 +1477,7 @@
         <w:spacing w:after="120" w:line="288"/>
       </w:pPr>
       <w:r>
-        <w:t xml:space="preserve">upay serves customers through a network of roughly 1,54,000 retail agents (end of 2023). Each agent holds a fixed total float split between physical </w:t>
+        <w:t xml:space="preserve">upay serves about 85 lakh customers through roughly 1,54,000 retail agents (end of 2023) [7]. When bank branches close for Eid, ATMs and MFS agents become the main way people get cash, and demand for cash withdrawals rises significantly [1]. Each agent holds a fixed total float split between physical </w:t>
       </w:r>
       <w:r>
         <w:rPr>
@@ -1825,7 +1853,7 @@
         <w:t xml:space="preserve">The agent</w:t>
       </w:r>
       <w:r>
-        <w:t xml:space="preserve"> loses the 0.41% commission on every failed cash-in and cash-out, on the busiest days of the year.</w:t>
+        <w:t xml:space="preserve"> loses the 0.41% commission on every failed cash-in and cash-out, on the busiest days of the year (rate from upay agent terms; not re-confirmed publicly, see Section 15).</w:t>
       </w:r>
     </w:p>
     <w:p>
@@ -1845,7 +1873,7 @@
         <w:t xml:space="preserve">upay</w:t>
       </w:r>
       <w:r>
-        <w:t xml:space="preserve"> loses its cash-out fee (1.0–1.4% by wallet type) net of the 0.51% channel commission, and risks losing the customer.</w:t>
+        <w:t xml:space="preserve"> loses its cash-out fee (1.4% primary, 1.0% salary and remittance, 0.7% disbursement wallet [8][9]) net of the 0.51% channel commission, and risks losing the customer.</w:t>
       </w:r>
     </w:p>
     <w:p>
@@ -1919,7 +1947,17 @@
         <w:t xml:space="preserve">1.6%</w:t>
       </w:r>
       <w:r>
-        <w:t xml:space="preserve"> on a normal day. The pain is concentrated in a few predictable windows, which is exactly what a forecaster can exploit.</w:t>
+        <w:t xml:space="preserve"> on a normal day. The pain is concentrated in a few predictable windows, which is exactly what a forecaster can exploit. These two rates come from our </w:t>
+      </w:r>
+      <w:r>
+        <w:rPr>
+          <w:b/>
+          <w:bCs/>
+        </w:rPr>
+        <w:t xml:space="preserve">synthetic</w:t>
+      </w:r>
+      <w:r>
+        <w:t xml:space="preserve"> network: no public source reports agent stockout rates, so their size is an assumption, while the direction (demand concentrated around Eid, salary and allowance days) is supported by the sources in Section 2.4.</w:t>
       </w:r>
     </w:p>
     <w:p>
@@ -2000,7 +2038,866 @@
         <w:pStyle w:val="Heading2"/>
       </w:pPr>
       <w:r>
-        <w:t xml:space="preserve">2.4 Why today's rule of thumb fails</w:t>
+        <w:t xml:space="preserve">2.4 Independent evidence that the problem is real</w:t>
+      </w:r>
+    </w:p>
+    <w:tbl>
+      <w:tblPr>
+        <w:tblW w:type="dxa" w:w="9026"/>
+        <w:tblBorders>
+          <w:top w:val="single" w:color="auto" w:sz="4"/>
+          <w:left w:val="single" w:color="auto" w:sz="4"/>
+          <w:bottom w:val="single" w:color="auto" w:sz="4"/>
+          <w:right w:val="single" w:color="auto" w:sz="4"/>
+          <w:insideH w:val="single" w:color="auto" w:sz="4"/>
+          <w:insideV w:val="single" w:color="auto" w:sz="4"/>
+        </w:tblBorders>
+      </w:tblPr>
+      <w:tblGrid>
+        <w:gridCol w:w="2500"/>
+        <w:gridCol w:w="4426"/>
+        <w:gridCol w:w="2100"/>
+      </w:tblGrid>
+      <w:tr>
+        <w:trPr>
+          <w:tblHeader/>
+        </w:trPr>
+        <w:tc>
+          <w:tcPr>
+            <w:tcW w:type="dxa" w:w="2500"/>
+            <w:tcBorders>
+              <w:top w:val="single" w:color="D9D7D0" w:sz="4"/>
+              <w:left w:val="single" w:color="D9D7D0" w:sz="4"/>
+              <w:bottom w:val="single" w:color="D9D7D0" w:sz="4"/>
+              <w:right w:val="single" w:color="D9D7D0" w:sz="4"/>
+            </w:tcBorders>
+            <w:shd w:fill="1F3B57" w:color="auto" w:val="clear"/>
+            <w:tcMar>
+              <w:top w:type="dxa" w:w="70"/>
+              <w:left w:type="dxa" w:w="110"/>
+              <w:bottom w:type="dxa" w:w="70"/>
+              <w:right w:type="dxa" w:w="110"/>
+            </w:tcMar>
+          </w:tcPr>
+          <w:p>
+            <w:pPr>
+              <w:jc w:val="left"/>
+            </w:pPr>
+            <w:r>
+              <w:rPr>
+                <w:b/>
+                <w:bCs/>
+                <w:color w:val="FFFFFF"/>
+                <w:sz w:val="19"/>
+                <w:szCs w:val="19"/>
+              </w:rPr>
+              <w:t xml:space="preserve">Fact</w:t>
+            </w:r>
+          </w:p>
+        </w:tc>
+        <w:tc>
+          <w:tcPr>
+            <w:tcW w:type="dxa" w:w="4426"/>
+            <w:tcBorders>
+              <w:top w:val="single" w:color="D9D7D0" w:sz="4"/>
+              <w:left w:val="single" w:color="D9D7D0" w:sz="4"/>
+              <w:bottom w:val="single" w:color="D9D7D0" w:sz="4"/>
+              <w:right w:val="single" w:color="D9D7D0" w:sz="4"/>
+            </w:tcBorders>
+            <w:shd w:fill="1F3B57" w:color="auto" w:val="clear"/>
+            <w:tcMar>
+              <w:top w:type="dxa" w:w="70"/>
+              <w:left w:type="dxa" w:w="110"/>
+              <w:bottom w:type="dxa" w:w="70"/>
+              <w:right w:type="dxa" w:w="110"/>
+            </w:tcMar>
+          </w:tcPr>
+          <w:p>
+            <w:pPr>
+              <w:jc w:val="left"/>
+            </w:pPr>
+            <w:r>
+              <w:rPr>
+                <w:b/>
+                <w:bCs/>
+                <w:color w:val="FFFFFF"/>
+                <w:sz w:val="19"/>
+                <w:szCs w:val="19"/>
+              </w:rPr>
+              <w:t xml:space="preserve">Evidence</w:t>
+            </w:r>
+          </w:p>
+        </w:tc>
+        <w:tc>
+          <w:tcPr>
+            <w:tcW w:type="dxa" w:w="2100"/>
+            <w:tcBorders>
+              <w:top w:val="single" w:color="D9D7D0" w:sz="4"/>
+              <w:left w:val="single" w:color="D9D7D0" w:sz="4"/>
+              <w:bottom w:val="single" w:color="D9D7D0" w:sz="4"/>
+              <w:right w:val="single" w:color="D9D7D0" w:sz="4"/>
+            </w:tcBorders>
+            <w:shd w:fill="1F3B57" w:color="auto" w:val="clear"/>
+            <w:tcMar>
+              <w:top w:type="dxa" w:w="70"/>
+              <w:left w:type="dxa" w:w="110"/>
+              <w:bottom w:type="dxa" w:w="70"/>
+              <w:right w:type="dxa" w:w="110"/>
+            </w:tcMar>
+          </w:tcPr>
+          <w:p>
+            <w:pPr>
+              <w:jc w:val="left"/>
+            </w:pPr>
+            <w:r>
+              <w:rPr>
+                <w:b/>
+                <w:bCs/>
+                <w:color w:val="FFFFFF"/>
+                <w:sz w:val="19"/>
+                <w:szCs w:val="19"/>
+              </w:rPr>
+              <w:t xml:space="preserve">Source</w:t>
+            </w:r>
+          </w:p>
+        </w:tc>
+      </w:tr>
+      <w:tr>
+        <w:tc>
+          <w:tcPr>
+            <w:tcW w:type="dxa" w:w="2500"/>
+            <w:tcBorders>
+              <w:top w:val="single" w:color="D9D7D0" w:sz="4"/>
+              <w:left w:val="single" w:color="D9D7D0" w:sz="4"/>
+              <w:bottom w:val="single" w:color="D9D7D0" w:sz="4"/>
+              <w:right w:val="single" w:color="D9D7D0" w:sz="4"/>
+            </w:tcBorders>
+            <w:tcMar>
+              <w:top w:type="dxa" w:w="70"/>
+              <w:left w:type="dxa" w:w="110"/>
+              <w:bottom w:type="dxa" w:w="70"/>
+              <w:right w:type="dxa" w:w="110"/>
+            </w:tcMar>
+          </w:tcPr>
+          <w:p>
+            <w:pPr>
+              <w:jc w:val="left"/>
+            </w:pPr>
+            <w:r>
+              <w:rPr>
+                <w:sz w:val="19"/>
+                <w:szCs w:val="19"/>
+              </w:rPr>
+              <w:t xml:space="preserve">Cash demand rises sharply at Eid; agents and ATMs are the main cash access when banks close</w:t>
+            </w:r>
+          </w:p>
+        </w:tc>
+        <w:tc>
+          <w:tcPr>
+            <w:tcW w:type="dxa" w:w="4426"/>
+            <w:tcBorders>
+              <w:top w:val="single" w:color="D9D7D0" w:sz="4"/>
+              <w:left w:val="single" w:color="D9D7D0" w:sz="4"/>
+              <w:bottom w:val="single" w:color="D9D7D0" w:sz="4"/>
+              <w:right w:val="single" w:color="D9D7D0" w:sz="4"/>
+            </w:tcBorders>
+            <w:tcMar>
+              <w:top w:type="dxa" w:w="70"/>
+              <w:left w:type="dxa" w:w="110"/>
+              <w:bottom w:type="dxa" w:w="70"/>
+              <w:right w:type="dxa" w:w="110"/>
+            </w:tcMar>
+          </w:tcPr>
+          <w:p>
+            <w:pPr>
+              <w:jc w:val="left"/>
+            </w:pPr>
+            <w:r>
+              <w:rPr>
+                <w:sz w:val="19"/>
+                <w:szCs w:val="19"/>
+              </w:rPr>
+              <w:t xml:space="preserve">“Demand for cash withdrawals from ATM booths rises significantly during Eid… ATM booths and MFS cash-out facilities become the primary means of accessing money.”</w:t>
+            </w:r>
+          </w:p>
+        </w:tc>
+        <w:tc>
+          <w:tcPr>
+            <w:tcW w:type="dxa" w:w="2100"/>
+            <w:tcBorders>
+              <w:top w:val="single" w:color="D9D7D0" w:sz="4"/>
+              <w:left w:val="single" w:color="D9D7D0" w:sz="4"/>
+              <w:bottom w:val="single" w:color="D9D7D0" w:sz="4"/>
+              <w:right w:val="single" w:color="D9D7D0" w:sz="4"/>
+            </w:tcBorders>
+            <w:tcMar>
+              <w:top w:type="dxa" w:w="70"/>
+              <w:left w:type="dxa" w:w="110"/>
+              <w:bottom w:type="dxa" w:w="70"/>
+              <w:right w:type="dxa" w:w="110"/>
+            </w:tcMar>
+          </w:tcPr>
+          <w:p>
+            <w:pPr>
+              <w:jc w:val="left"/>
+            </w:pPr>
+            <w:r>
+              <w:rPr>
+                <w:sz w:val="19"/>
+                <w:szCs w:val="19"/>
+              </w:rPr>
+              <w:t xml:space="preserve">Prothom Alo, 16 Mar 2026 [1]</w:t>
+            </w:r>
+          </w:p>
+        </w:tc>
+      </w:tr>
+      <w:tr>
+        <w:tc>
+          <w:tcPr>
+            <w:tcW w:type="dxa" w:w="2500"/>
+            <w:tcBorders>
+              <w:top w:val="single" w:color="D9D7D0" w:sz="4"/>
+              <w:left w:val="single" w:color="D9D7D0" w:sz="4"/>
+              <w:bottom w:val="single" w:color="D9D7D0" w:sz="4"/>
+              <w:right w:val="single" w:color="D9D7D0" w:sz="4"/>
+            </w:tcBorders>
+            <w:shd w:fill="F7F7F5" w:color="auto" w:val="clear"/>
+            <w:tcMar>
+              <w:top w:type="dxa" w:w="70"/>
+              <w:left w:type="dxa" w:w="110"/>
+              <w:bottom w:type="dxa" w:w="70"/>
+              <w:right w:type="dxa" w:w="110"/>
+            </w:tcMar>
+          </w:tcPr>
+          <w:p>
+            <w:pPr>
+              <w:jc w:val="left"/>
+            </w:pPr>
+            <w:r>
+              <w:rPr>
+                <w:sz w:val="19"/>
+                <w:szCs w:val="19"/>
+              </w:rPr>
+              <w:t xml:space="preserve">Cash demand surges before Eid-ul-Adha; companies withdraw cash for bonuses</w:t>
+            </w:r>
+          </w:p>
+        </w:tc>
+        <w:tc>
+          <w:tcPr>
+            <w:tcW w:type="dxa" w:w="4426"/>
+            <w:tcBorders>
+              <w:top w:val="single" w:color="D9D7D0" w:sz="4"/>
+              <w:left w:val="single" w:color="D9D7D0" w:sz="4"/>
+              <w:bottom w:val="single" w:color="D9D7D0" w:sz="4"/>
+              <w:right w:val="single" w:color="D9D7D0" w:sz="4"/>
+            </w:tcBorders>
+            <w:shd w:fill="F7F7F5" w:color="auto" w:val="clear"/>
+            <w:tcMar>
+              <w:top w:type="dxa" w:w="70"/>
+              <w:left w:type="dxa" w:w="110"/>
+              <w:bottom w:type="dxa" w:w="70"/>
+              <w:right w:type="dxa" w:w="110"/>
+            </w:tcMar>
+          </w:tcPr>
+          <w:p>
+            <w:pPr>
+              <w:jc w:val="left"/>
+            </w:pPr>
+            <w:r>
+              <w:rPr>
+                <w:sz w:val="19"/>
+                <w:szCs w:val="19"/>
+              </w:rPr>
+              <w:t xml:space="preserve">“Demand for cash rises sharply around cattle markets during Eid-ul-Adha. Companies also withdraw cash to pay bonuses…”</w:t>
+            </w:r>
+          </w:p>
+        </w:tc>
+        <w:tc>
+          <w:tcPr>
+            <w:tcW w:type="dxa" w:w="2100"/>
+            <w:tcBorders>
+              <w:top w:val="single" w:color="D9D7D0" w:sz="4"/>
+              <w:left w:val="single" w:color="D9D7D0" w:sz="4"/>
+              <w:bottom w:val="single" w:color="D9D7D0" w:sz="4"/>
+              <w:right w:val="single" w:color="D9D7D0" w:sz="4"/>
+            </w:tcBorders>
+            <w:shd w:fill="F7F7F5" w:color="auto" w:val="clear"/>
+            <w:tcMar>
+              <w:top w:type="dxa" w:w="70"/>
+              <w:left w:type="dxa" w:w="110"/>
+              <w:bottom w:type="dxa" w:w="70"/>
+              <w:right w:type="dxa" w:w="110"/>
+            </w:tcMar>
+          </w:tcPr>
+          <w:p>
+            <w:pPr>
+              <w:jc w:val="left"/>
+            </w:pPr>
+            <w:r>
+              <w:rPr>
+                <w:sz w:val="19"/>
+                <w:szCs w:val="19"/>
+              </w:rPr>
+              <w:t xml:space="preserve">The Business Standard, 16 May 2026 [5]</w:t>
+            </w:r>
+          </w:p>
+        </w:tc>
+      </w:tr>
+      <w:tr>
+        <w:tc>
+          <w:tcPr>
+            <w:tcW w:type="dxa" w:w="2500"/>
+            <w:tcBorders>
+              <w:top w:val="single" w:color="D9D7D0" w:sz="4"/>
+              <w:left w:val="single" w:color="D9D7D0" w:sz="4"/>
+              <w:bottom w:val="single" w:color="D9D7D0" w:sz="4"/>
+              <w:right w:val="single" w:color="D9D7D0" w:sz="4"/>
+            </w:tcBorders>
+            <w:tcMar>
+              <w:top w:type="dxa" w:w="70"/>
+              <w:left w:type="dxa" w:w="110"/>
+              <w:bottom w:type="dxa" w:w="70"/>
+              <w:right w:type="dxa" w:w="110"/>
+            </w:tcMar>
+          </w:tcPr>
+          <w:p>
+            <w:pPr>
+              <w:jc w:val="left"/>
+            </w:pPr>
+            <w:r>
+              <w:rPr>
+                <w:sz w:val="19"/>
+                <w:szCs w:val="19"/>
+              </w:rPr>
+              <w:t xml:space="preserve">Remittances peak before Eid</w:t>
+            </w:r>
+          </w:p>
+        </w:tc>
+        <w:tc>
+          <w:tcPr>
+            <w:tcW w:type="dxa" w:w="4426"/>
+            <w:tcBorders>
+              <w:top w:val="single" w:color="D9D7D0" w:sz="4"/>
+              <w:left w:val="single" w:color="D9D7D0" w:sz="4"/>
+              <w:bottom w:val="single" w:color="D9D7D0" w:sz="4"/>
+              <w:right w:val="single" w:color="D9D7D0" w:sz="4"/>
+            </w:tcBorders>
+            <w:tcMar>
+              <w:top w:type="dxa" w:w="70"/>
+              <w:left w:type="dxa" w:w="110"/>
+              <w:bottom w:type="dxa" w:w="70"/>
+              <w:right w:type="dxa" w:w="110"/>
+            </w:tcMar>
+          </w:tcPr>
+          <w:p>
+            <w:pPr>
+              <w:jc w:val="left"/>
+            </w:pPr>
+            <w:r>
+              <w:rPr>
+                <w:sz w:val="19"/>
+                <w:szCs w:val="19"/>
+              </w:rPr>
+              <w:t xml:space="preserve">Record USD 2.94 billion in the first 26 days of March 2025; “Usually, remittances peak before Eid.”</w:t>
+            </w:r>
+          </w:p>
+        </w:tc>
+        <w:tc>
+          <w:tcPr>
+            <w:tcW w:type="dxa" w:w="2100"/>
+            <w:tcBorders>
+              <w:top w:val="single" w:color="D9D7D0" w:sz="4"/>
+              <w:left w:val="single" w:color="D9D7D0" w:sz="4"/>
+              <w:bottom w:val="single" w:color="D9D7D0" w:sz="4"/>
+              <w:right w:val="single" w:color="D9D7D0" w:sz="4"/>
+            </w:tcBorders>
+            <w:tcMar>
+              <w:top w:type="dxa" w:w="70"/>
+              <w:left w:type="dxa" w:w="110"/>
+              <w:bottom w:type="dxa" w:w="70"/>
+              <w:right w:type="dxa" w:w="110"/>
+            </w:tcMar>
+          </w:tcPr>
+          <w:p>
+            <w:pPr>
+              <w:jc w:val="left"/>
+            </w:pPr>
+            <w:r>
+              <w:rPr>
+                <w:sz w:val="19"/>
+                <w:szCs w:val="19"/>
+              </w:rPr>
+              <w:t xml:space="preserve">Prothom Alo, 27 Mar 2025 [2]</w:t>
+            </w:r>
+          </w:p>
+        </w:tc>
+      </w:tr>
+      <w:tr>
+        <w:tc>
+          <w:tcPr>
+            <w:tcW w:type="dxa" w:w="2500"/>
+            <w:tcBorders>
+              <w:top w:val="single" w:color="D9D7D0" w:sz="4"/>
+              <w:left w:val="single" w:color="D9D7D0" w:sz="4"/>
+              <w:bottom w:val="single" w:color="D9D7D0" w:sz="4"/>
+              <w:right w:val="single" w:color="D9D7D0" w:sz="4"/>
+            </w:tcBorders>
+            <w:shd w:fill="F7F7F5" w:color="auto" w:val="clear"/>
+            <w:tcMar>
+              <w:top w:type="dxa" w:w="70"/>
+              <w:left w:type="dxa" w:w="110"/>
+              <w:bottom w:type="dxa" w:w="70"/>
+              <w:right w:type="dxa" w:w="110"/>
+            </w:tcMar>
+          </w:tcPr>
+          <w:p>
+            <w:pPr>
+              <w:jc w:val="left"/>
+            </w:pPr>
+            <w:r>
+              <w:rPr>
+                <w:sz w:val="19"/>
+                <w:szCs w:val="19"/>
+              </w:rPr>
+              <w:t xml:space="preserve">Record monthly remittance driven by Ramadan and Eid</w:t>
+            </w:r>
+          </w:p>
+        </w:tc>
+        <w:tc>
+          <w:tcPr>
+            <w:tcW w:type="dxa" w:w="4426"/>
+            <w:tcBorders>
+              <w:top w:val="single" w:color="D9D7D0" w:sz="4"/>
+              <w:left w:val="single" w:color="D9D7D0" w:sz="4"/>
+              <w:bottom w:val="single" w:color="D9D7D0" w:sz="4"/>
+              <w:right w:val="single" w:color="D9D7D0" w:sz="4"/>
+            </w:tcBorders>
+            <w:shd w:fill="F7F7F5" w:color="auto" w:val="clear"/>
+            <w:tcMar>
+              <w:top w:type="dxa" w:w="70"/>
+              <w:left w:type="dxa" w:w="110"/>
+              <w:bottom w:type="dxa" w:w="70"/>
+              <w:right w:type="dxa" w:w="110"/>
+            </w:tcMar>
+          </w:tcPr>
+          <w:p>
+            <w:pPr>
+              <w:jc w:val="left"/>
+            </w:pPr>
+            <w:r>
+              <w:rPr>
+                <w:sz w:val="19"/>
+                <w:szCs w:val="19"/>
+              </w:rPr>
+              <w:t xml:space="preserve">USD 3.29 billion in March 2025, “due to expatriates sending more money… marking… Eid-ul-Fitr”</w:t>
+            </w:r>
+          </w:p>
+        </w:tc>
+        <w:tc>
+          <w:tcPr>
+            <w:tcW w:type="dxa" w:w="2100"/>
+            <w:tcBorders>
+              <w:top w:val="single" w:color="D9D7D0" w:sz="4"/>
+              <w:left w:val="single" w:color="D9D7D0" w:sz="4"/>
+              <w:bottom w:val="single" w:color="D9D7D0" w:sz="4"/>
+              <w:right w:val="single" w:color="D9D7D0" w:sz="4"/>
+            </w:tcBorders>
+            <w:shd w:fill="F7F7F5" w:color="auto" w:val="clear"/>
+            <w:tcMar>
+              <w:top w:type="dxa" w:w="70"/>
+              <w:left w:type="dxa" w:w="110"/>
+              <w:bottom w:type="dxa" w:w="70"/>
+              <w:right w:type="dxa" w:w="110"/>
+            </w:tcMar>
+          </w:tcPr>
+          <w:p>
+            <w:pPr>
+              <w:jc w:val="left"/>
+            </w:pPr>
+            <w:r>
+              <w:rPr>
+                <w:sz w:val="19"/>
+                <w:szCs w:val="19"/>
+              </w:rPr>
+              <w:t xml:space="preserve">The Business Standard, 6 Apr 2025 [3]</w:t>
+            </w:r>
+          </w:p>
+        </w:tc>
+      </w:tr>
+      <w:tr>
+        <w:tc>
+          <w:tcPr>
+            <w:tcW w:type="dxa" w:w="2500"/>
+            <w:tcBorders>
+              <w:top w:val="single" w:color="D9D7D0" w:sz="4"/>
+              <w:left w:val="single" w:color="D9D7D0" w:sz="4"/>
+              <w:bottom w:val="single" w:color="D9D7D0" w:sz="4"/>
+              <w:right w:val="single" w:color="D9D7D0" w:sz="4"/>
+            </w:tcBorders>
+            <w:tcMar>
+              <w:top w:type="dxa" w:w="70"/>
+              <w:left w:type="dxa" w:w="110"/>
+              <w:bottom w:type="dxa" w:w="70"/>
+              <w:right w:type="dxa" w:w="110"/>
+            </w:tcMar>
+          </w:tcPr>
+          <w:p>
+            <w:pPr>
+              <w:jc w:val="left"/>
+            </w:pPr>
+            <w:r>
+              <w:rPr>
+                <w:sz w:val="19"/>
+                <w:szCs w:val="19"/>
+              </w:rPr>
+              <w:t xml:space="preserve">MFS volumes peak in Eid months; cash-in/cash-out dominate</w:t>
+            </w:r>
+          </w:p>
+        </w:tc>
+        <w:tc>
+          <w:tcPr>
+            <w:tcW w:type="dxa" w:w="4426"/>
+            <w:tcBorders>
+              <w:top w:val="single" w:color="D9D7D0" w:sz="4"/>
+              <w:left w:val="single" w:color="D9D7D0" w:sz="4"/>
+              <w:bottom w:val="single" w:color="D9D7D0" w:sz="4"/>
+              <w:right w:val="single" w:color="D9D7D0" w:sz="4"/>
+            </w:tcBorders>
+            <w:tcMar>
+              <w:top w:type="dxa" w:w="70"/>
+              <w:left w:type="dxa" w:w="110"/>
+              <w:bottom w:type="dxa" w:w="70"/>
+              <w:right w:type="dxa" w:w="110"/>
+            </w:tcMar>
+          </w:tcPr>
+          <w:p>
+            <w:pPr>
+              <w:jc w:val="left"/>
+            </w:pPr>
+            <w:r>
+              <w:rPr>
+                <w:sz w:val="19"/>
+                <w:szCs w:val="19"/>
+              </w:rPr>
+              <w:t xml:space="preserve">Record Tk 1.25 lakh crore in April 2023 (Ramadan and Eid); cash-in and cash-out were 59% of transactions</w:t>
+            </w:r>
+          </w:p>
+        </w:tc>
+        <w:tc>
+          <w:tcPr>
+            <w:tcW w:type="dxa" w:w="2100"/>
+            <w:tcBorders>
+              <w:top w:val="single" w:color="D9D7D0" w:sz="4"/>
+              <w:left w:val="single" w:color="D9D7D0" w:sz="4"/>
+              <w:bottom w:val="single" w:color="D9D7D0" w:sz="4"/>
+              <w:right w:val="single" w:color="D9D7D0" w:sz="4"/>
+            </w:tcBorders>
+            <w:tcMar>
+              <w:top w:type="dxa" w:w="70"/>
+              <w:left w:type="dxa" w:w="110"/>
+              <w:bottom w:type="dxa" w:w="70"/>
+              <w:right w:type="dxa" w:w="110"/>
+            </w:tcMar>
+          </w:tcPr>
+          <w:p>
+            <w:pPr>
+              <w:jc w:val="left"/>
+            </w:pPr>
+            <w:r>
+              <w:rPr>
+                <w:sz w:val="19"/>
+                <w:szCs w:val="19"/>
+              </w:rPr>
+              <w:t xml:space="preserve">The Daily Star, 2023 [4]</w:t>
+            </w:r>
+          </w:p>
+        </w:tc>
+      </w:tr>
+      <w:tr>
+        <w:tc>
+          <w:tcPr>
+            <w:tcW w:type="dxa" w:w="2500"/>
+            <w:tcBorders>
+              <w:top w:val="single" w:color="D9D7D0" w:sz="4"/>
+              <w:left w:val="single" w:color="D9D7D0" w:sz="4"/>
+              <w:bottom w:val="single" w:color="D9D7D0" w:sz="4"/>
+              <w:right w:val="single" w:color="D9D7D0" w:sz="4"/>
+            </w:tcBorders>
+            <w:shd w:fill="F7F7F5" w:color="auto" w:val="clear"/>
+            <w:tcMar>
+              <w:top w:type="dxa" w:w="70"/>
+              <w:left w:type="dxa" w:w="110"/>
+              <w:bottom w:type="dxa" w:w="70"/>
+              <w:right w:type="dxa" w:w="110"/>
+            </w:tcMar>
+          </w:tcPr>
+          <w:p>
+            <w:pPr>
+              <w:jc w:val="left"/>
+            </w:pPr>
+            <w:r>
+              <w:rPr>
+                <w:sz w:val="19"/>
+                <w:szCs w:val="19"/>
+              </w:rPr>
+              <w:t xml:space="preserve">Salaries reach workers through MFS</w:t>
+            </w:r>
+          </w:p>
+        </w:tc>
+        <w:tc>
+          <w:tcPr>
+            <w:tcW w:type="dxa" w:w="4426"/>
+            <w:tcBorders>
+              <w:top w:val="single" w:color="D9D7D0" w:sz="4"/>
+              <w:left w:val="single" w:color="D9D7D0" w:sz="4"/>
+              <w:bottom w:val="single" w:color="D9D7D0" w:sz="4"/>
+              <w:right w:val="single" w:color="D9D7D0" w:sz="4"/>
+            </w:tcBorders>
+            <w:shd w:fill="F7F7F5" w:color="auto" w:val="clear"/>
+            <w:tcMar>
+              <w:top w:type="dxa" w:w="70"/>
+              <w:left w:type="dxa" w:w="110"/>
+              <w:bottom w:type="dxa" w:w="70"/>
+              <w:right w:type="dxa" w:w="110"/>
+            </w:tcMar>
+          </w:tcPr>
+          <w:p>
+            <w:pPr>
+              <w:jc w:val="left"/>
+            </w:pPr>
+            <w:r>
+              <w:rPr>
+                <w:sz w:val="19"/>
+                <w:szCs w:val="19"/>
+              </w:rPr>
+              <w:t xml:space="preserve">About 11 lakh garment workers were paid digitally in 2020; about 40% of workers are paid digitally</w:t>
+            </w:r>
+          </w:p>
+        </w:tc>
+        <w:tc>
+          <w:tcPr>
+            <w:tcW w:type="dxa" w:w="2100"/>
+            <w:tcBorders>
+              <w:top w:val="single" w:color="D9D7D0" w:sz="4"/>
+              <w:left w:val="single" w:color="D9D7D0" w:sz="4"/>
+              <w:bottom w:val="single" w:color="D9D7D0" w:sz="4"/>
+              <w:right w:val="single" w:color="D9D7D0" w:sz="4"/>
+            </w:tcBorders>
+            <w:shd w:fill="F7F7F5" w:color="auto" w:val="clear"/>
+            <w:tcMar>
+              <w:top w:type="dxa" w:w="70"/>
+              <w:left w:type="dxa" w:w="110"/>
+              <w:bottom w:type="dxa" w:w="70"/>
+              <w:right w:type="dxa" w:w="110"/>
+            </w:tcMar>
+          </w:tcPr>
+          <w:p>
+            <w:pPr>
+              <w:jc w:val="left"/>
+            </w:pPr>
+            <w:r>
+              <w:rPr>
+                <w:sz w:val="19"/>
+                <w:szCs w:val="19"/>
+              </w:rPr>
+              <w:t xml:space="preserve">The Business Standard, 16 Mar 2021 [6]</w:t>
+            </w:r>
+          </w:p>
+        </w:tc>
+      </w:tr>
+      <w:tr>
+        <w:tc>
+          <w:tcPr>
+            <w:tcW w:type="dxa" w:w="2500"/>
+            <w:tcBorders>
+              <w:top w:val="single" w:color="D9D7D0" w:sz="4"/>
+              <w:left w:val="single" w:color="D9D7D0" w:sz="4"/>
+              <w:bottom w:val="single" w:color="D9D7D0" w:sz="4"/>
+              <w:right w:val="single" w:color="D9D7D0" w:sz="4"/>
+            </w:tcBorders>
+            <w:tcMar>
+              <w:top w:type="dxa" w:w="70"/>
+              <w:left w:type="dxa" w:w="110"/>
+              <w:bottom w:type="dxa" w:w="70"/>
+              <w:right w:type="dxa" w:w="110"/>
+            </w:tcMar>
+          </w:tcPr>
+          <w:p>
+            <w:pPr>
+              <w:jc w:val="left"/>
+            </w:pPr>
+            <w:r>
+              <w:rPr>
+                <w:sz w:val="19"/>
+                <w:szCs w:val="19"/>
+              </w:rPr>
+              <w:t xml:space="preserve">Government allowances (G2P) are paid into MFS wallets</w:t>
+            </w:r>
+          </w:p>
+        </w:tc>
+        <w:tc>
+          <w:tcPr>
+            <w:tcW w:type="dxa" w:w="4426"/>
+            <w:tcBorders>
+              <w:top w:val="single" w:color="D9D7D0" w:sz="4"/>
+              <w:left w:val="single" w:color="D9D7D0" w:sz="4"/>
+              <w:bottom w:val="single" w:color="D9D7D0" w:sz="4"/>
+              <w:right w:val="single" w:color="D9D7D0" w:sz="4"/>
+            </w:tcBorders>
+            <w:tcMar>
+              <w:top w:type="dxa" w:w="70"/>
+              <w:left w:type="dxa" w:w="110"/>
+              <w:bottom w:type="dxa" w:w="70"/>
+              <w:right w:type="dxa" w:w="110"/>
+            </w:tcMar>
+          </w:tcPr>
+          <w:p>
+            <w:pPr>
+              <w:jc w:val="left"/>
+            </w:pPr>
+            <w:r>
+              <w:rPr>
+                <w:sz w:val="19"/>
+                <w:szCs w:val="19"/>
+              </w:rPr>
+              <w:t xml:space="preserve">Over 75 lakh people received about Tk 1,624 crore of allowances through one MFS provider in FY26</w:t>
+            </w:r>
+          </w:p>
+        </w:tc>
+        <w:tc>
+          <w:tcPr>
+            <w:tcW w:type="dxa" w:w="2100"/>
+            <w:tcBorders>
+              <w:top w:val="single" w:color="D9D7D0" w:sz="4"/>
+              <w:left w:val="single" w:color="D9D7D0" w:sz="4"/>
+              <w:bottom w:val="single" w:color="D9D7D0" w:sz="4"/>
+              <w:right w:val="single" w:color="D9D7D0" w:sz="4"/>
+            </w:tcBorders>
+            <w:tcMar>
+              <w:top w:type="dxa" w:w="70"/>
+              <w:left w:type="dxa" w:w="110"/>
+              <w:bottom w:type="dxa" w:w="70"/>
+              <w:right w:type="dxa" w:w="110"/>
+            </w:tcMar>
+          </w:tcPr>
+          <w:p>
+            <w:pPr>
+              <w:jc w:val="left"/>
+            </w:pPr>
+            <w:r>
+              <w:rPr>
+                <w:sz w:val="19"/>
+                <w:szCs w:val="19"/>
+              </w:rPr>
+              <w:t xml:space="preserve">The Business Standard, 5 Nov 2025 [10]</w:t>
+            </w:r>
+          </w:p>
+        </w:tc>
+      </w:tr>
+      <w:tr>
+        <w:tc>
+          <w:tcPr>
+            <w:tcW w:type="dxa" w:w="2500"/>
+            <w:tcBorders>
+              <w:top w:val="single" w:color="D9D7D0" w:sz="4"/>
+              <w:left w:val="single" w:color="D9D7D0" w:sz="4"/>
+              <w:bottom w:val="single" w:color="D9D7D0" w:sz="4"/>
+              <w:right w:val="single" w:color="D9D7D0" w:sz="4"/>
+            </w:tcBorders>
+            <w:shd w:fill="F7F7F5" w:color="auto" w:val="clear"/>
+            <w:tcMar>
+              <w:top w:type="dxa" w:w="70"/>
+              <w:left w:type="dxa" w:w="110"/>
+              <w:bottom w:type="dxa" w:w="70"/>
+              <w:right w:type="dxa" w:w="110"/>
+            </w:tcMar>
+          </w:tcPr>
+          <w:p>
+            <w:pPr>
+              <w:jc w:val="left"/>
+            </w:pPr>
+            <w:r>
+              <w:rPr>
+                <w:sz w:val="19"/>
+                <w:szCs w:val="19"/>
+              </w:rPr>
+              <w:t xml:space="preserve">Agent liquidity is a core problem of mobile money worldwide</w:t>
+            </w:r>
+          </w:p>
+        </w:tc>
+        <w:tc>
+          <w:tcPr>
+            <w:tcW w:type="dxa" w:w="4426"/>
+            <w:tcBorders>
+              <w:top w:val="single" w:color="D9D7D0" w:sz="4"/>
+              <w:left w:val="single" w:color="D9D7D0" w:sz="4"/>
+              <w:bottom w:val="single" w:color="D9D7D0" w:sz="4"/>
+              <w:right w:val="single" w:color="D9D7D0" w:sz="4"/>
+            </w:tcBorders>
+            <w:shd w:fill="F7F7F5" w:color="auto" w:val="clear"/>
+            <w:tcMar>
+              <w:top w:type="dxa" w:w="70"/>
+              <w:left w:type="dxa" w:w="110"/>
+              <w:bottom w:type="dxa" w:w="70"/>
+              <w:right w:type="dxa" w:w="110"/>
+            </w:tcMar>
+          </w:tcPr>
+          <w:p>
+            <w:pPr>
+              <w:jc w:val="left"/>
+            </w:pPr>
+            <w:r>
+              <w:rPr>
+                <w:sz w:val="19"/>
+                <w:szCs w:val="19"/>
+              </w:rPr>
+              <w:t xml:space="preserve">“Solving the liquidity management challenge is one of the next big issues facing mobile money”; liquidity is the agents' primary cost (CGAP research)</w:t>
+            </w:r>
+          </w:p>
+        </w:tc>
+        <w:tc>
+          <w:tcPr>
+            <w:tcW w:type="dxa" w:w="2100"/>
+            <w:tcBorders>
+              <w:top w:val="single" w:color="D9D7D0" w:sz="4"/>
+              <w:left w:val="single" w:color="D9D7D0" w:sz="4"/>
+              <w:bottom w:val="single" w:color="D9D7D0" w:sz="4"/>
+              <w:right w:val="single" w:color="D9D7D0" w:sz="4"/>
+            </w:tcBorders>
+            <w:shd w:fill="F7F7F5" w:color="auto" w:val="clear"/>
+            <w:tcMar>
+              <w:top w:type="dxa" w:w="70"/>
+              <w:left w:type="dxa" w:w="110"/>
+              <w:bottom w:type="dxa" w:w="70"/>
+              <w:right w:type="dxa" w:w="110"/>
+            </w:tcMar>
+          </w:tcPr>
+          <w:p>
+            <w:pPr>
+              <w:jc w:val="left"/>
+            </w:pPr>
+            <w:r>
+              <w:rPr>
+                <w:sz w:val="19"/>
+                <w:szCs w:val="19"/>
+              </w:rPr>
+              <w:t xml:space="preserve">IFC Mobile Money Toolkit [11]</w:t>
+            </w:r>
+          </w:p>
+        </w:tc>
+      </w:tr>
+    </w:tbl>
+    <w:p>
+      <w:pPr>
+        <w:spacing w:after="60"/>
+      </w:pPr>
+    </w:p>
+    <w:p>
+      <w:pPr>
+        <w:pStyle w:val="Heading2"/>
+      </w:pPr>
+      <w:r>
+        <w:t xml:space="preserve">2.5 Why today's rule of thumb fails</w:t>
       </w:r>
     </w:p>
     <w:p>
@@ -2008,7 +2905,7 @@
         <w:spacing w:after="120" w:line="288"/>
       </w:pPr>
       <w:r>
-        <w:t xml:space="preserve">Agents and DSOs top up to about 1.5× the last 7 days' average when the balance falls below 0.6× of that target. An average only sees the past. Eid moves about 11 days earlier every year, and salary and allowance days follow the calendar, not the average. For the demo agent the average keeps climbing during the pre-Eid rush and peaks on Eid day, after demand has already fallen by about three-quarters.</w:t>
+        <w:t xml:space="preserve">Agents and DSOs top up to about 1.5× the last 7 days' average when the balance falls below 0.6× of that target. An average only sees the past. Eid moves 10–11 days earlier every year (11 April 2024, 31 March 2025, 21 March 2026 in Bangladesh [12]), and salary and allowance days follow the calendar, not the average. For the demo agent the average keeps climbing during the pre-Eid rush and peaks on Eid day, after demand has already fallen by about three-quarters.</w:t>
       </w:r>
     </w:p>
     <w:p>
@@ -2089,7 +2986,7 @@
         <w:pStyle w:val="Heading2"/>
       </w:pPr>
       <w:r>
-        <w:t xml:space="preserve">2.5 Problem statement</w:t>
+        <w:t xml:space="preserve">2.6 Problem statement</w:t>
       </w:r>
     </w:p>
     <w:tbl>
@@ -2108,6 +3005,9 @@
         <w:gridCol w:w="9026"/>
       </w:tblGrid>
       <w:tr>
+        <w:trPr>
+          <w:cantSplit/>
+        </w:trPr>
         <w:tc>
           <w:tcPr>
             <w:tcW w:type="dxa" w:w="9026"/>
@@ -4970,7 +5870,7 @@
                 <w:sz w:val="19"/>
                 <w:szCs w:val="19"/>
               </w:rPr>
-              <w:t xml:space="preserve">11 April 2024, 31 March 2025, 20 March 2026</w:t>
+              <w:t xml:space="preserve">11 April 2024, 31 March 2025, 20 March 2026 (Bangladesh celebrated on 21 March 2026 [12]; see Section 15)</w:t>
             </w:r>
           </w:p>
         </w:tc>
@@ -5030,7 +5930,7 @@
                 <w:sz w:val="19"/>
                 <w:szCs w:val="19"/>
               </w:rPr>
-              <w:t xml:space="preserve">17 June 2024, 7 June 2025, 27 May 2026</w:t>
+              <w:t xml:space="preserve">17 June 2024, 7 June 2025, 27 May 2026 (Bangladesh celebrated on 28 May 2026 [13]; see Section 15)</w:t>
             </w:r>
           </w:p>
         </w:tc>
@@ -5073,6 +5973,9 @@
         <w:gridCol w:w="9026"/>
       </w:tblGrid>
       <w:tr>
+        <w:trPr>
+          <w:cantSplit/>
+        </w:trPr>
         <w:tc>
           <w:tcPr>
             <w:tcW w:type="dxa" w:w="9026"/>
@@ -7720,6 +8623,9 @@
         <w:gridCol w:w="9026"/>
       </w:tblGrid>
       <w:tr>
+        <w:trPr>
+          <w:cantSplit/>
+        </w:trPr>
         <w:tc>
           <w:tcPr>
             <w:tcW w:type="dxa" w:w="9026"/>
@@ -8435,6 +9341,9 @@
         <w:gridCol w:w="9026"/>
       </w:tblGrid>
       <w:tr>
+        <w:trPr>
+          <w:cantSplit/>
+        </w:trPr>
         <w:tc>
           <w:tcPr>
             <w:tcW w:type="dxa" w:w="9026"/>
@@ -15164,6 +16073,9 @@
         <w:gridCol w:w="9026"/>
       </w:tblGrid>
       <w:tr>
+        <w:trPr>
+          <w:cantSplit/>
+        </w:trPr>
         <w:tc>
           <w:tcPr>
             <w:tcW w:type="dxa" w:w="9026"/>
@@ -16361,6 +17273,9 @@
         <w:gridCol w:w="9026"/>
       </w:tblGrid>
       <w:tr>
+        <w:trPr>
+          <w:cantSplit/>
+        </w:trPr>
         <w:tc>
           <w:tcPr>
             <w:tcW w:type="dxa" w:w="9026"/>
@@ -16391,6 +17306,3080 @@
             </w:r>
             <w:r>
               <w:t xml:space="preserve"> one distributor, anonymised daily agent balances and DSO visit logs, and one Eid season, measured against today's rule.</w:t>
+            </w:r>
+          </w:p>
+        </w:tc>
+      </w:tr>
+    </w:tbl>
+    <w:p>
+      <w:pPr>
+        <w:pStyle w:val="Heading1"/>
+        <w:pageBreakBefore/>
+      </w:pPr>
+      <w:r>
+        <w:t xml:space="preserve">15. Validation of claims</w:t>
+      </w:r>
+    </w:p>
+    <w:p>
+      <w:pPr>
+        <w:spacing w:after="120" w:line="288"/>
+      </w:pPr>
+      <w:r>
+        <w:t xml:space="preserve">Every claim in this report falls into one of four groups. We kept them separate so that a reader can see exactly what is proven, by whom, and what still needs real data.</w:t>
+      </w:r>
+    </w:p>
+    <w:tbl>
+      <w:tblPr>
+        <w:tblW w:type="dxa" w:w="9026"/>
+        <w:tblBorders>
+          <w:top w:val="single" w:color="auto" w:sz="4"/>
+          <w:left w:val="single" w:color="auto" w:sz="4"/>
+          <w:bottom w:val="single" w:color="auto" w:sz="4"/>
+          <w:right w:val="single" w:color="auto" w:sz="4"/>
+          <w:insideH w:val="single" w:color="auto" w:sz="4"/>
+          <w:insideV w:val="single" w:color="auto" w:sz="4"/>
+        </w:tblBorders>
+      </w:tblPr>
+      <w:tblGrid>
+        <w:gridCol w:w="2600"/>
+        <w:gridCol w:w="6426"/>
+      </w:tblGrid>
+      <w:tr>
+        <w:trPr>
+          <w:tblHeader/>
+        </w:trPr>
+        <w:tc>
+          <w:tcPr>
+            <w:tcW w:type="dxa" w:w="2600"/>
+            <w:tcBorders>
+              <w:top w:val="single" w:color="D9D7D0" w:sz="4"/>
+              <w:left w:val="single" w:color="D9D7D0" w:sz="4"/>
+              <w:bottom w:val="single" w:color="D9D7D0" w:sz="4"/>
+              <w:right w:val="single" w:color="D9D7D0" w:sz="4"/>
+            </w:tcBorders>
+            <w:shd w:fill="1F3B57" w:color="auto" w:val="clear"/>
+            <w:tcMar>
+              <w:top w:type="dxa" w:w="70"/>
+              <w:left w:type="dxa" w:w="110"/>
+              <w:bottom w:type="dxa" w:w="70"/>
+              <w:right w:type="dxa" w:w="110"/>
+            </w:tcMar>
+          </w:tcPr>
+          <w:p>
+            <w:pPr>
+              <w:jc w:val="left"/>
+            </w:pPr>
+            <w:r>
+              <w:rPr>
+                <w:b/>
+                <w:bCs/>
+                <w:color w:val="FFFFFF"/>
+                <w:sz w:val="19"/>
+                <w:szCs w:val="19"/>
+              </w:rPr>
+              <w:t xml:space="preserve">Status</w:t>
+            </w:r>
+          </w:p>
+        </w:tc>
+        <w:tc>
+          <w:tcPr>
+            <w:tcW w:type="dxa" w:w="6426"/>
+            <w:tcBorders>
+              <w:top w:val="single" w:color="D9D7D0" w:sz="4"/>
+              <w:left w:val="single" w:color="D9D7D0" w:sz="4"/>
+              <w:bottom w:val="single" w:color="D9D7D0" w:sz="4"/>
+              <w:right w:val="single" w:color="D9D7D0" w:sz="4"/>
+            </w:tcBorders>
+            <w:shd w:fill="1F3B57" w:color="auto" w:val="clear"/>
+            <w:tcMar>
+              <w:top w:type="dxa" w:w="70"/>
+              <w:left w:type="dxa" w:w="110"/>
+              <w:bottom w:type="dxa" w:w="70"/>
+              <w:right w:type="dxa" w:w="110"/>
+            </w:tcMar>
+          </w:tcPr>
+          <w:p>
+            <w:pPr>
+              <w:jc w:val="left"/>
+            </w:pPr>
+            <w:r>
+              <w:rPr>
+                <w:b/>
+                <w:bCs/>
+                <w:color w:val="FFFFFF"/>
+                <w:sz w:val="19"/>
+                <w:szCs w:val="19"/>
+              </w:rPr>
+              <w:t xml:space="preserve">Meaning</w:t>
+            </w:r>
+          </w:p>
+        </w:tc>
+      </w:tr>
+      <w:tr>
+        <w:tc>
+          <w:tcPr>
+            <w:tcW w:type="dxa" w:w="2600"/>
+            <w:tcBorders>
+              <w:top w:val="single" w:color="D9D7D0" w:sz="4"/>
+              <w:left w:val="single" w:color="D9D7D0" w:sz="4"/>
+              <w:bottom w:val="single" w:color="D9D7D0" w:sz="4"/>
+              <w:right w:val="single" w:color="D9D7D0" w:sz="4"/>
+            </w:tcBorders>
+            <w:tcMar>
+              <w:top w:type="dxa" w:w="70"/>
+              <w:left w:type="dxa" w:w="110"/>
+              <w:bottom w:type="dxa" w:w="70"/>
+              <w:right w:type="dxa" w:w="110"/>
+            </w:tcMar>
+          </w:tcPr>
+          <w:p>
+            <w:pPr>
+              <w:jc w:val="left"/>
+            </w:pPr>
+            <w:r>
+              <w:rPr>
+                <w:sz w:val="19"/>
+                <w:szCs w:val="19"/>
+              </w:rPr>
+              <w:t xml:space="preserve">Verified (external)</w:t>
+            </w:r>
+          </w:p>
+        </w:tc>
+        <w:tc>
+          <w:tcPr>
+            <w:tcW w:type="dxa" w:w="6426"/>
+            <w:tcBorders>
+              <w:top w:val="single" w:color="D9D7D0" w:sz="4"/>
+              <w:left w:val="single" w:color="D9D7D0" w:sz="4"/>
+              <w:bottom w:val="single" w:color="D9D7D0" w:sz="4"/>
+              <w:right w:val="single" w:color="D9D7D0" w:sz="4"/>
+            </w:tcBorders>
+            <w:tcMar>
+              <w:top w:type="dxa" w:w="70"/>
+              <w:left w:type="dxa" w:w="110"/>
+              <w:bottom w:type="dxa" w:w="70"/>
+              <w:right w:type="dxa" w:w="110"/>
+            </w:tcMar>
+          </w:tcPr>
+          <w:p>
+            <w:pPr>
+              <w:jc w:val="left"/>
+            </w:pPr>
+            <w:r>
+              <w:rPr>
+                <w:sz w:val="19"/>
+                <w:szCs w:val="19"/>
+              </w:rPr>
+              <w:t xml:space="preserve">Confirmed by an independent public source listed in Appendix C</w:t>
+            </w:r>
+          </w:p>
+        </w:tc>
+      </w:tr>
+      <w:tr>
+        <w:tc>
+          <w:tcPr>
+            <w:tcW w:type="dxa" w:w="2600"/>
+            <w:tcBorders>
+              <w:top w:val="single" w:color="D9D7D0" w:sz="4"/>
+              <w:left w:val="single" w:color="D9D7D0" w:sz="4"/>
+              <w:bottom w:val="single" w:color="D9D7D0" w:sz="4"/>
+              <w:right w:val="single" w:color="D9D7D0" w:sz="4"/>
+            </w:tcBorders>
+            <w:shd w:fill="F7F7F5" w:color="auto" w:val="clear"/>
+            <w:tcMar>
+              <w:top w:type="dxa" w:w="70"/>
+              <w:left w:type="dxa" w:w="110"/>
+              <w:bottom w:type="dxa" w:w="70"/>
+              <w:right w:type="dxa" w:w="110"/>
+            </w:tcMar>
+          </w:tcPr>
+          <w:p>
+            <w:pPr>
+              <w:jc w:val="left"/>
+            </w:pPr>
+            <w:r>
+              <w:rPr>
+                <w:sz w:val="19"/>
+                <w:szCs w:val="19"/>
+              </w:rPr>
+              <w:t xml:space="preserve">Verified (our code)</w:t>
+            </w:r>
+          </w:p>
+        </w:tc>
+        <w:tc>
+          <w:tcPr>
+            <w:tcW w:type="dxa" w:w="6426"/>
+            <w:tcBorders>
+              <w:top w:val="single" w:color="D9D7D0" w:sz="4"/>
+              <w:left w:val="single" w:color="D9D7D0" w:sz="4"/>
+              <w:bottom w:val="single" w:color="D9D7D0" w:sz="4"/>
+              <w:right w:val="single" w:color="D9D7D0" w:sz="4"/>
+            </w:tcBorders>
+            <w:shd w:fill="F7F7F5" w:color="auto" w:val="clear"/>
+            <w:tcMar>
+              <w:top w:type="dxa" w:w="70"/>
+              <w:left w:type="dxa" w:w="110"/>
+              <w:bottom w:type="dxa" w:w="70"/>
+              <w:right w:type="dxa" w:w="110"/>
+            </w:tcMar>
+          </w:tcPr>
+          <w:p>
+            <w:pPr>
+              <w:jc w:val="left"/>
+            </w:pPr>
+            <w:r>
+              <w:rPr>
+                <w:sz w:val="19"/>
+                <w:szCs w:val="19"/>
+              </w:rPr>
+              <w:t xml:space="preserve">Produced and checked by FloatWise code on synthetic data; reproducible from the repository and covered by tests; not yet tested on real upay data</w:t>
+            </w:r>
+          </w:p>
+        </w:tc>
+      </w:tr>
+      <w:tr>
+        <w:tc>
+          <w:tcPr>
+            <w:tcW w:type="dxa" w:w="2600"/>
+            <w:tcBorders>
+              <w:top w:val="single" w:color="D9D7D0" w:sz="4"/>
+              <w:left w:val="single" w:color="D9D7D0" w:sz="4"/>
+              <w:bottom w:val="single" w:color="D9D7D0" w:sz="4"/>
+              <w:right w:val="single" w:color="D9D7D0" w:sz="4"/>
+            </w:tcBorders>
+            <w:tcMar>
+              <w:top w:type="dxa" w:w="70"/>
+              <w:left w:type="dxa" w:w="110"/>
+              <w:bottom w:type="dxa" w:w="70"/>
+              <w:right w:type="dxa" w:w="110"/>
+            </w:tcMar>
+          </w:tcPr>
+          <w:p>
+            <w:pPr>
+              <w:jc w:val="left"/>
+            </w:pPr>
+            <w:r>
+              <w:rPr>
+                <w:sz w:val="19"/>
+                <w:szCs w:val="19"/>
+              </w:rPr>
+              <w:t xml:space="preserve">Assumption</w:t>
+            </w:r>
+          </w:p>
+        </w:tc>
+        <w:tc>
+          <w:tcPr>
+            <w:tcW w:type="dxa" w:w="6426"/>
+            <w:tcBorders>
+              <w:top w:val="single" w:color="D9D7D0" w:sz="4"/>
+              <w:left w:val="single" w:color="D9D7D0" w:sz="4"/>
+              <w:bottom w:val="single" w:color="D9D7D0" w:sz="4"/>
+              <w:right w:val="single" w:color="D9D7D0" w:sz="4"/>
+            </w:tcBorders>
+            <w:tcMar>
+              <w:top w:type="dxa" w:w="70"/>
+              <w:left w:type="dxa" w:w="110"/>
+              <w:bottom w:type="dxa" w:w="70"/>
+              <w:right w:type="dxa" w:w="110"/>
+            </w:tcMar>
+          </w:tcPr>
+          <w:p>
+            <w:pPr>
+              <w:jc w:val="left"/>
+            </w:pPr>
+            <w:r>
+              <w:rPr>
+                <w:sz w:val="19"/>
+                <w:szCs w:val="19"/>
+              </w:rPr>
+              <w:t xml:space="preserve">A value we chose because no public source exists; documented in config.yaml and DATA_ASSUMPTIONS.md</w:t>
+            </w:r>
+          </w:p>
+        </w:tc>
+      </w:tr>
+      <w:tr>
+        <w:tc>
+          <w:tcPr>
+            <w:tcW w:type="dxa" w:w="2600"/>
+            <w:tcBorders>
+              <w:top w:val="single" w:color="D9D7D0" w:sz="4"/>
+              <w:left w:val="single" w:color="D9D7D0" w:sz="4"/>
+              <w:bottom w:val="single" w:color="D9D7D0" w:sz="4"/>
+              <w:right w:val="single" w:color="D9D7D0" w:sz="4"/>
+            </w:tcBorders>
+            <w:shd w:fill="F7F7F5" w:color="auto" w:val="clear"/>
+            <w:tcMar>
+              <w:top w:type="dxa" w:w="70"/>
+              <w:left w:type="dxa" w:w="110"/>
+              <w:bottom w:type="dxa" w:w="70"/>
+              <w:right w:type="dxa" w:w="110"/>
+            </w:tcMar>
+          </w:tcPr>
+          <w:p>
+            <w:pPr>
+              <w:jc w:val="left"/>
+            </w:pPr>
+            <w:r>
+              <w:rPr>
+                <w:sz w:val="19"/>
+                <w:szCs w:val="19"/>
+              </w:rPr>
+              <w:t xml:space="preserve">Not re-confirmed / Discrepancy</w:t>
+            </w:r>
+          </w:p>
+        </w:tc>
+        <w:tc>
+          <w:tcPr>
+            <w:tcW w:type="dxa" w:w="6426"/>
+            <w:tcBorders>
+              <w:top w:val="single" w:color="D9D7D0" w:sz="4"/>
+              <w:left w:val="single" w:color="D9D7D0" w:sz="4"/>
+              <w:bottom w:val="single" w:color="D9D7D0" w:sz="4"/>
+              <w:right w:val="single" w:color="D9D7D0" w:sz="4"/>
+            </w:tcBorders>
+            <w:shd w:fill="F7F7F5" w:color="auto" w:val="clear"/>
+            <w:tcMar>
+              <w:top w:type="dxa" w:w="70"/>
+              <w:left w:type="dxa" w:w="110"/>
+              <w:bottom w:type="dxa" w:w="70"/>
+              <w:right w:type="dxa" w:w="110"/>
+            </w:tcMar>
+          </w:tcPr>
+          <w:p>
+            <w:pPr>
+              <w:jc w:val="left"/>
+            </w:pPr>
+            <w:r>
+              <w:rPr>
+                <w:sz w:val="19"/>
+                <w:szCs w:val="19"/>
+              </w:rPr>
+              <w:t xml:space="preserve">A source was used earlier but could not be re-checked, or the check found a difference</w:t>
+            </w:r>
+          </w:p>
+        </w:tc>
+      </w:tr>
+    </w:tbl>
+    <w:p>
+      <w:pPr>
+        <w:spacing w:after="60"/>
+      </w:pPr>
+    </w:p>
+    <w:p>
+      <w:pPr>
+        <w:pStyle w:val="Heading2"/>
+      </w:pPr>
+      <w:r>
+        <w:t xml:space="preserve">15.1 Facts about Bangladesh, MFS and upay</w:t>
+      </w:r>
+    </w:p>
+    <w:tbl>
+      <w:tblPr>
+        <w:tblW w:type="dxa" w:w="9026"/>
+        <w:tblBorders>
+          <w:top w:val="single" w:color="auto" w:sz="4"/>
+          <w:left w:val="single" w:color="auto" w:sz="4"/>
+          <w:bottom w:val="single" w:color="auto" w:sz="4"/>
+          <w:right w:val="single" w:color="auto" w:sz="4"/>
+          <w:insideH w:val="single" w:color="auto" w:sz="4"/>
+          <w:insideV w:val="single" w:color="auto" w:sz="4"/>
+        </w:tblBorders>
+      </w:tblPr>
+      <w:tblGrid>
+        <w:gridCol w:w="3300"/>
+        <w:gridCol w:w="1700"/>
+        <w:gridCol w:w="4026"/>
+      </w:tblGrid>
+      <w:tr>
+        <w:trPr>
+          <w:tblHeader/>
+        </w:trPr>
+        <w:tc>
+          <w:tcPr>
+            <w:tcW w:type="dxa" w:w="3300"/>
+            <w:tcBorders>
+              <w:top w:val="single" w:color="D9D7D0" w:sz="4"/>
+              <w:left w:val="single" w:color="D9D7D0" w:sz="4"/>
+              <w:bottom w:val="single" w:color="D9D7D0" w:sz="4"/>
+              <w:right w:val="single" w:color="D9D7D0" w:sz="4"/>
+            </w:tcBorders>
+            <w:shd w:fill="1F3B57" w:color="auto" w:val="clear"/>
+            <w:tcMar>
+              <w:top w:type="dxa" w:w="70"/>
+              <w:left w:type="dxa" w:w="110"/>
+              <w:bottom w:type="dxa" w:w="70"/>
+              <w:right w:type="dxa" w:w="110"/>
+            </w:tcMar>
+          </w:tcPr>
+          <w:p>
+            <w:pPr>
+              <w:jc w:val="left"/>
+            </w:pPr>
+            <w:r>
+              <w:rPr>
+                <w:b/>
+                <w:bCs/>
+                <w:color w:val="FFFFFF"/>
+                <w:sz w:val="19"/>
+                <w:szCs w:val="19"/>
+              </w:rPr>
+              <w:t xml:space="preserve">Claim</w:t>
+            </w:r>
+          </w:p>
+        </w:tc>
+        <w:tc>
+          <w:tcPr>
+            <w:tcW w:type="dxa" w:w="1700"/>
+            <w:tcBorders>
+              <w:top w:val="single" w:color="D9D7D0" w:sz="4"/>
+              <w:left w:val="single" w:color="D9D7D0" w:sz="4"/>
+              <w:bottom w:val="single" w:color="D9D7D0" w:sz="4"/>
+              <w:right w:val="single" w:color="D9D7D0" w:sz="4"/>
+            </w:tcBorders>
+            <w:shd w:fill="1F3B57" w:color="auto" w:val="clear"/>
+            <w:tcMar>
+              <w:top w:type="dxa" w:w="70"/>
+              <w:left w:type="dxa" w:w="110"/>
+              <w:bottom w:type="dxa" w:w="70"/>
+              <w:right w:type="dxa" w:w="110"/>
+            </w:tcMar>
+          </w:tcPr>
+          <w:p>
+            <w:pPr>
+              <w:jc w:val="left"/>
+            </w:pPr>
+            <w:r>
+              <w:rPr>
+                <w:b/>
+                <w:bCs/>
+                <w:color w:val="FFFFFF"/>
+                <w:sz w:val="19"/>
+                <w:szCs w:val="19"/>
+              </w:rPr>
+              <w:t xml:space="preserve">Status</w:t>
+            </w:r>
+          </w:p>
+        </w:tc>
+        <w:tc>
+          <w:tcPr>
+            <w:tcW w:type="dxa" w:w="4026"/>
+            <w:tcBorders>
+              <w:top w:val="single" w:color="D9D7D0" w:sz="4"/>
+              <w:left w:val="single" w:color="D9D7D0" w:sz="4"/>
+              <w:bottom w:val="single" w:color="D9D7D0" w:sz="4"/>
+              <w:right w:val="single" w:color="D9D7D0" w:sz="4"/>
+            </w:tcBorders>
+            <w:shd w:fill="1F3B57" w:color="auto" w:val="clear"/>
+            <w:tcMar>
+              <w:top w:type="dxa" w:w="70"/>
+              <w:left w:type="dxa" w:w="110"/>
+              <w:bottom w:type="dxa" w:w="70"/>
+              <w:right w:type="dxa" w:w="110"/>
+            </w:tcMar>
+          </w:tcPr>
+          <w:p>
+            <w:pPr>
+              <w:jc w:val="left"/>
+            </w:pPr>
+            <w:r>
+              <w:rPr>
+                <w:b/>
+                <w:bCs/>
+                <w:color w:val="FFFFFF"/>
+                <w:sz w:val="19"/>
+                <w:szCs w:val="19"/>
+              </w:rPr>
+              <w:t xml:space="preserve">Evidence</w:t>
+            </w:r>
+          </w:p>
+        </w:tc>
+      </w:tr>
+      <w:tr>
+        <w:tc>
+          <w:tcPr>
+            <w:tcW w:type="dxa" w:w="3300"/>
+            <w:tcBorders>
+              <w:top w:val="single" w:color="D9D7D0" w:sz="4"/>
+              <w:left w:val="single" w:color="D9D7D0" w:sz="4"/>
+              <w:bottom w:val="single" w:color="D9D7D0" w:sz="4"/>
+              <w:right w:val="single" w:color="D9D7D0" w:sz="4"/>
+            </w:tcBorders>
+            <w:tcMar>
+              <w:top w:type="dxa" w:w="70"/>
+              <w:left w:type="dxa" w:w="110"/>
+              <w:bottom w:type="dxa" w:w="70"/>
+              <w:right w:type="dxa" w:w="110"/>
+            </w:tcMar>
+          </w:tcPr>
+          <w:p>
+            <w:pPr>
+              <w:jc w:val="left"/>
+            </w:pPr>
+            <w:r>
+              <w:rPr>
+                <w:sz w:val="19"/>
+                <w:szCs w:val="19"/>
+              </w:rPr>
+              <w:t xml:space="preserve">Cash demand rises sharply around Eid; agents and ATMs are the main cash access when banks close</w:t>
+            </w:r>
+          </w:p>
+        </w:tc>
+        <w:tc>
+          <w:tcPr>
+            <w:tcW w:type="dxa" w:w="1700"/>
+            <w:tcBorders>
+              <w:top w:val="single" w:color="D9D7D0" w:sz="4"/>
+              <w:left w:val="single" w:color="D9D7D0" w:sz="4"/>
+              <w:bottom w:val="single" w:color="D9D7D0" w:sz="4"/>
+              <w:right w:val="single" w:color="D9D7D0" w:sz="4"/>
+            </w:tcBorders>
+            <w:tcMar>
+              <w:top w:type="dxa" w:w="70"/>
+              <w:left w:type="dxa" w:w="110"/>
+              <w:bottom w:type="dxa" w:w="70"/>
+              <w:right w:type="dxa" w:w="110"/>
+            </w:tcMar>
+          </w:tcPr>
+          <w:p>
+            <w:pPr>
+              <w:jc w:val="left"/>
+            </w:pPr>
+            <w:r>
+              <w:rPr>
+                <w:sz w:val="19"/>
+                <w:szCs w:val="19"/>
+              </w:rPr>
+              <w:t xml:space="preserve">Verified (external)</w:t>
+            </w:r>
+          </w:p>
+        </w:tc>
+        <w:tc>
+          <w:tcPr>
+            <w:tcW w:type="dxa" w:w="4026"/>
+            <w:tcBorders>
+              <w:top w:val="single" w:color="D9D7D0" w:sz="4"/>
+              <w:left w:val="single" w:color="D9D7D0" w:sz="4"/>
+              <w:bottom w:val="single" w:color="D9D7D0" w:sz="4"/>
+              <w:right w:val="single" w:color="D9D7D0" w:sz="4"/>
+            </w:tcBorders>
+            <w:tcMar>
+              <w:top w:type="dxa" w:w="70"/>
+              <w:left w:type="dxa" w:w="110"/>
+              <w:bottom w:type="dxa" w:w="70"/>
+              <w:right w:type="dxa" w:w="110"/>
+            </w:tcMar>
+          </w:tcPr>
+          <w:p>
+            <w:pPr>
+              <w:jc w:val="left"/>
+            </w:pPr>
+            <w:r>
+              <w:rPr>
+                <w:sz w:val="19"/>
+                <w:szCs w:val="19"/>
+              </w:rPr>
+              <w:t xml:space="preserve">Prothom Alo [1]; The Business Standard [5]</w:t>
+            </w:r>
+          </w:p>
+        </w:tc>
+      </w:tr>
+      <w:tr>
+        <w:tc>
+          <w:tcPr>
+            <w:tcW w:type="dxa" w:w="3300"/>
+            <w:tcBorders>
+              <w:top w:val="single" w:color="D9D7D0" w:sz="4"/>
+              <w:left w:val="single" w:color="D9D7D0" w:sz="4"/>
+              <w:bottom w:val="single" w:color="D9D7D0" w:sz="4"/>
+              <w:right w:val="single" w:color="D9D7D0" w:sz="4"/>
+            </w:tcBorders>
+            <w:shd w:fill="F7F7F5" w:color="auto" w:val="clear"/>
+            <w:tcMar>
+              <w:top w:type="dxa" w:w="70"/>
+              <w:left w:type="dxa" w:w="110"/>
+              <w:bottom w:type="dxa" w:w="70"/>
+              <w:right w:type="dxa" w:w="110"/>
+            </w:tcMar>
+          </w:tcPr>
+          <w:p>
+            <w:pPr>
+              <w:jc w:val="left"/>
+            </w:pPr>
+            <w:r>
+              <w:rPr>
+                <w:sz w:val="19"/>
+                <w:szCs w:val="19"/>
+              </w:rPr>
+              <w:t xml:space="preserve">Remittances peak before Eid-ul-Fitr</w:t>
+            </w:r>
+          </w:p>
+        </w:tc>
+        <w:tc>
+          <w:tcPr>
+            <w:tcW w:type="dxa" w:w="1700"/>
+            <w:tcBorders>
+              <w:top w:val="single" w:color="D9D7D0" w:sz="4"/>
+              <w:left w:val="single" w:color="D9D7D0" w:sz="4"/>
+              <w:bottom w:val="single" w:color="D9D7D0" w:sz="4"/>
+              <w:right w:val="single" w:color="D9D7D0" w:sz="4"/>
+            </w:tcBorders>
+            <w:shd w:fill="F7F7F5" w:color="auto" w:val="clear"/>
+            <w:tcMar>
+              <w:top w:type="dxa" w:w="70"/>
+              <w:left w:type="dxa" w:w="110"/>
+              <w:bottom w:type="dxa" w:w="70"/>
+              <w:right w:type="dxa" w:w="110"/>
+            </w:tcMar>
+          </w:tcPr>
+          <w:p>
+            <w:pPr>
+              <w:jc w:val="left"/>
+            </w:pPr>
+            <w:r>
+              <w:rPr>
+                <w:sz w:val="19"/>
+                <w:szCs w:val="19"/>
+              </w:rPr>
+              <w:t xml:space="preserve">Verified (external)</w:t>
+            </w:r>
+          </w:p>
+        </w:tc>
+        <w:tc>
+          <w:tcPr>
+            <w:tcW w:type="dxa" w:w="4026"/>
+            <w:tcBorders>
+              <w:top w:val="single" w:color="D9D7D0" w:sz="4"/>
+              <w:left w:val="single" w:color="D9D7D0" w:sz="4"/>
+              <w:bottom w:val="single" w:color="D9D7D0" w:sz="4"/>
+              <w:right w:val="single" w:color="D9D7D0" w:sz="4"/>
+            </w:tcBorders>
+            <w:shd w:fill="F7F7F5" w:color="auto" w:val="clear"/>
+            <w:tcMar>
+              <w:top w:type="dxa" w:w="70"/>
+              <w:left w:type="dxa" w:w="110"/>
+              <w:bottom w:type="dxa" w:w="70"/>
+              <w:right w:type="dxa" w:w="110"/>
+            </w:tcMar>
+          </w:tcPr>
+          <w:p>
+            <w:pPr>
+              <w:jc w:val="left"/>
+            </w:pPr>
+            <w:r>
+              <w:rPr>
+                <w:sz w:val="19"/>
+                <w:szCs w:val="19"/>
+              </w:rPr>
+              <w:t xml:space="preserve">Prothom Alo [2]; The Business Standard [3]</w:t>
+            </w:r>
+          </w:p>
+        </w:tc>
+      </w:tr>
+      <w:tr>
+        <w:tc>
+          <w:tcPr>
+            <w:tcW w:type="dxa" w:w="3300"/>
+            <w:tcBorders>
+              <w:top w:val="single" w:color="D9D7D0" w:sz="4"/>
+              <w:left w:val="single" w:color="D9D7D0" w:sz="4"/>
+              <w:bottom w:val="single" w:color="D9D7D0" w:sz="4"/>
+              <w:right w:val="single" w:color="D9D7D0" w:sz="4"/>
+            </w:tcBorders>
+            <w:tcMar>
+              <w:top w:type="dxa" w:w="70"/>
+              <w:left w:type="dxa" w:w="110"/>
+              <w:bottom w:type="dxa" w:w="70"/>
+              <w:right w:type="dxa" w:w="110"/>
+            </w:tcMar>
+          </w:tcPr>
+          <w:p>
+            <w:pPr>
+              <w:jc w:val="left"/>
+            </w:pPr>
+            <w:r>
+              <w:rPr>
+                <w:sz w:val="19"/>
+                <w:szCs w:val="19"/>
+              </w:rPr>
+              <w:t xml:space="preserve">MFS volumes hit records in Eid months; cash-in/out dominate</w:t>
+            </w:r>
+          </w:p>
+        </w:tc>
+        <w:tc>
+          <w:tcPr>
+            <w:tcW w:type="dxa" w:w="1700"/>
+            <w:tcBorders>
+              <w:top w:val="single" w:color="D9D7D0" w:sz="4"/>
+              <w:left w:val="single" w:color="D9D7D0" w:sz="4"/>
+              <w:bottom w:val="single" w:color="D9D7D0" w:sz="4"/>
+              <w:right w:val="single" w:color="D9D7D0" w:sz="4"/>
+            </w:tcBorders>
+            <w:tcMar>
+              <w:top w:type="dxa" w:w="70"/>
+              <w:left w:type="dxa" w:w="110"/>
+              <w:bottom w:type="dxa" w:w="70"/>
+              <w:right w:type="dxa" w:w="110"/>
+            </w:tcMar>
+          </w:tcPr>
+          <w:p>
+            <w:pPr>
+              <w:jc w:val="left"/>
+            </w:pPr>
+            <w:r>
+              <w:rPr>
+                <w:sz w:val="19"/>
+                <w:szCs w:val="19"/>
+              </w:rPr>
+              <w:t xml:space="preserve">Verified (external)</w:t>
+            </w:r>
+          </w:p>
+        </w:tc>
+        <w:tc>
+          <w:tcPr>
+            <w:tcW w:type="dxa" w:w="4026"/>
+            <w:tcBorders>
+              <w:top w:val="single" w:color="D9D7D0" w:sz="4"/>
+              <w:left w:val="single" w:color="D9D7D0" w:sz="4"/>
+              <w:bottom w:val="single" w:color="D9D7D0" w:sz="4"/>
+              <w:right w:val="single" w:color="D9D7D0" w:sz="4"/>
+            </w:tcBorders>
+            <w:tcMar>
+              <w:top w:type="dxa" w:w="70"/>
+              <w:left w:type="dxa" w:w="110"/>
+              <w:bottom w:type="dxa" w:w="70"/>
+              <w:right w:type="dxa" w:w="110"/>
+            </w:tcMar>
+          </w:tcPr>
+          <w:p>
+            <w:pPr>
+              <w:jc w:val="left"/>
+            </w:pPr>
+            <w:r>
+              <w:rPr>
+                <w:sz w:val="19"/>
+                <w:szCs w:val="19"/>
+              </w:rPr>
+              <w:t xml:space="preserve">The Daily Star [4]</w:t>
+            </w:r>
+          </w:p>
+        </w:tc>
+      </w:tr>
+      <w:tr>
+        <w:tc>
+          <w:tcPr>
+            <w:tcW w:type="dxa" w:w="3300"/>
+            <w:tcBorders>
+              <w:top w:val="single" w:color="D9D7D0" w:sz="4"/>
+              <w:left w:val="single" w:color="D9D7D0" w:sz="4"/>
+              <w:bottom w:val="single" w:color="D9D7D0" w:sz="4"/>
+              <w:right w:val="single" w:color="D9D7D0" w:sz="4"/>
+            </w:tcBorders>
+            <w:shd w:fill="F7F7F5" w:color="auto" w:val="clear"/>
+            <w:tcMar>
+              <w:top w:type="dxa" w:w="70"/>
+              <w:left w:type="dxa" w:w="110"/>
+              <w:bottom w:type="dxa" w:w="70"/>
+              <w:right w:type="dxa" w:w="110"/>
+            </w:tcMar>
+          </w:tcPr>
+          <w:p>
+            <w:pPr>
+              <w:jc w:val="left"/>
+            </w:pPr>
+            <w:r>
+              <w:rPr>
+                <w:sz w:val="19"/>
+                <w:szCs w:val="19"/>
+              </w:rPr>
+              <w:t xml:space="preserve">Salaries and government allowances are paid through MFS</w:t>
+            </w:r>
+          </w:p>
+        </w:tc>
+        <w:tc>
+          <w:tcPr>
+            <w:tcW w:type="dxa" w:w="1700"/>
+            <w:tcBorders>
+              <w:top w:val="single" w:color="D9D7D0" w:sz="4"/>
+              <w:left w:val="single" w:color="D9D7D0" w:sz="4"/>
+              <w:bottom w:val="single" w:color="D9D7D0" w:sz="4"/>
+              <w:right w:val="single" w:color="D9D7D0" w:sz="4"/>
+            </w:tcBorders>
+            <w:shd w:fill="F7F7F5" w:color="auto" w:val="clear"/>
+            <w:tcMar>
+              <w:top w:type="dxa" w:w="70"/>
+              <w:left w:type="dxa" w:w="110"/>
+              <w:bottom w:type="dxa" w:w="70"/>
+              <w:right w:type="dxa" w:w="110"/>
+            </w:tcMar>
+          </w:tcPr>
+          <w:p>
+            <w:pPr>
+              <w:jc w:val="left"/>
+            </w:pPr>
+            <w:r>
+              <w:rPr>
+                <w:sz w:val="19"/>
+                <w:szCs w:val="19"/>
+              </w:rPr>
+              <w:t xml:space="preserve">Verified (external)</w:t>
+            </w:r>
+          </w:p>
+        </w:tc>
+        <w:tc>
+          <w:tcPr>
+            <w:tcW w:type="dxa" w:w="4026"/>
+            <w:tcBorders>
+              <w:top w:val="single" w:color="D9D7D0" w:sz="4"/>
+              <w:left w:val="single" w:color="D9D7D0" w:sz="4"/>
+              <w:bottom w:val="single" w:color="D9D7D0" w:sz="4"/>
+              <w:right w:val="single" w:color="D9D7D0" w:sz="4"/>
+            </w:tcBorders>
+            <w:shd w:fill="F7F7F5" w:color="auto" w:val="clear"/>
+            <w:tcMar>
+              <w:top w:type="dxa" w:w="70"/>
+              <w:left w:type="dxa" w:w="110"/>
+              <w:bottom w:type="dxa" w:w="70"/>
+              <w:right w:type="dxa" w:w="110"/>
+            </w:tcMar>
+          </w:tcPr>
+          <w:p>
+            <w:pPr>
+              <w:jc w:val="left"/>
+            </w:pPr>
+            <w:r>
+              <w:rPr>
+                <w:sz w:val="19"/>
+                <w:szCs w:val="19"/>
+              </w:rPr>
+              <w:t xml:space="preserve">The Business Standard [6], [10]</w:t>
+            </w:r>
+          </w:p>
+        </w:tc>
+      </w:tr>
+      <w:tr>
+        <w:tc>
+          <w:tcPr>
+            <w:tcW w:type="dxa" w:w="3300"/>
+            <w:tcBorders>
+              <w:top w:val="single" w:color="D9D7D0" w:sz="4"/>
+              <w:left w:val="single" w:color="D9D7D0" w:sz="4"/>
+              <w:bottom w:val="single" w:color="D9D7D0" w:sz="4"/>
+              <w:right w:val="single" w:color="D9D7D0" w:sz="4"/>
+            </w:tcBorders>
+            <w:tcMar>
+              <w:top w:type="dxa" w:w="70"/>
+              <w:left w:type="dxa" w:w="110"/>
+              <w:bottom w:type="dxa" w:w="70"/>
+              <w:right w:type="dxa" w:w="110"/>
+            </w:tcMar>
+          </w:tcPr>
+          <w:p>
+            <w:pPr>
+              <w:jc w:val="left"/>
+            </w:pPr>
+            <w:r>
+              <w:rPr>
+                <w:sz w:val="19"/>
+                <w:szCs w:val="19"/>
+              </w:rPr>
+              <w:t xml:space="preserve">Agent liquidity is a known, costly problem in mobile money</w:t>
+            </w:r>
+          </w:p>
+        </w:tc>
+        <w:tc>
+          <w:tcPr>
+            <w:tcW w:type="dxa" w:w="1700"/>
+            <w:tcBorders>
+              <w:top w:val="single" w:color="D9D7D0" w:sz="4"/>
+              <w:left w:val="single" w:color="D9D7D0" w:sz="4"/>
+              <w:bottom w:val="single" w:color="D9D7D0" w:sz="4"/>
+              <w:right w:val="single" w:color="D9D7D0" w:sz="4"/>
+            </w:tcBorders>
+            <w:tcMar>
+              <w:top w:type="dxa" w:w="70"/>
+              <w:left w:type="dxa" w:w="110"/>
+              <w:bottom w:type="dxa" w:w="70"/>
+              <w:right w:type="dxa" w:w="110"/>
+            </w:tcMar>
+          </w:tcPr>
+          <w:p>
+            <w:pPr>
+              <w:jc w:val="left"/>
+            </w:pPr>
+            <w:r>
+              <w:rPr>
+                <w:sz w:val="19"/>
+                <w:szCs w:val="19"/>
+              </w:rPr>
+              <w:t xml:space="preserve">Verified (external)</w:t>
+            </w:r>
+          </w:p>
+        </w:tc>
+        <w:tc>
+          <w:tcPr>
+            <w:tcW w:type="dxa" w:w="4026"/>
+            <w:tcBorders>
+              <w:top w:val="single" w:color="D9D7D0" w:sz="4"/>
+              <w:left w:val="single" w:color="D9D7D0" w:sz="4"/>
+              <w:bottom w:val="single" w:color="D9D7D0" w:sz="4"/>
+              <w:right w:val="single" w:color="D9D7D0" w:sz="4"/>
+            </w:tcBorders>
+            <w:tcMar>
+              <w:top w:type="dxa" w:w="70"/>
+              <w:left w:type="dxa" w:w="110"/>
+              <w:bottom w:type="dxa" w:w="70"/>
+              <w:right w:type="dxa" w:w="110"/>
+            </w:tcMar>
+          </w:tcPr>
+          <w:p>
+            <w:pPr>
+              <w:jc w:val="left"/>
+            </w:pPr>
+            <w:r>
+              <w:rPr>
+                <w:sz w:val="19"/>
+                <w:szCs w:val="19"/>
+              </w:rPr>
+              <w:t xml:space="preserve">IFC Mobile Money Toolkit [11]</w:t>
+            </w:r>
+          </w:p>
+        </w:tc>
+      </w:tr>
+      <w:tr>
+        <w:tc>
+          <w:tcPr>
+            <w:tcW w:type="dxa" w:w="3300"/>
+            <w:tcBorders>
+              <w:top w:val="single" w:color="D9D7D0" w:sz="4"/>
+              <w:left w:val="single" w:color="D9D7D0" w:sz="4"/>
+              <w:bottom w:val="single" w:color="D9D7D0" w:sz="4"/>
+              <w:right w:val="single" w:color="D9D7D0" w:sz="4"/>
+            </w:tcBorders>
+            <w:shd w:fill="F7F7F5" w:color="auto" w:val="clear"/>
+            <w:tcMar>
+              <w:top w:type="dxa" w:w="70"/>
+              <w:left w:type="dxa" w:w="110"/>
+              <w:bottom w:type="dxa" w:w="70"/>
+              <w:right w:type="dxa" w:w="110"/>
+            </w:tcMar>
+          </w:tcPr>
+          <w:p>
+            <w:pPr>
+              <w:jc w:val="left"/>
+            </w:pPr>
+            <w:r>
+              <w:rPr>
+                <w:sz w:val="19"/>
+                <w:szCs w:val="19"/>
+              </w:rPr>
+              <w:t xml:space="preserve">upay has ~1,54,000 agents and ~85 lakh customers (end-2023)</w:t>
+            </w:r>
+          </w:p>
+        </w:tc>
+        <w:tc>
+          <w:tcPr>
+            <w:tcW w:type="dxa" w:w="1700"/>
+            <w:tcBorders>
+              <w:top w:val="single" w:color="D9D7D0" w:sz="4"/>
+              <w:left w:val="single" w:color="D9D7D0" w:sz="4"/>
+              <w:bottom w:val="single" w:color="D9D7D0" w:sz="4"/>
+              <w:right w:val="single" w:color="D9D7D0" w:sz="4"/>
+            </w:tcBorders>
+            <w:shd w:fill="F7F7F5" w:color="auto" w:val="clear"/>
+            <w:tcMar>
+              <w:top w:type="dxa" w:w="70"/>
+              <w:left w:type="dxa" w:w="110"/>
+              <w:bottom w:type="dxa" w:w="70"/>
+              <w:right w:type="dxa" w:w="110"/>
+            </w:tcMar>
+          </w:tcPr>
+          <w:p>
+            <w:pPr>
+              <w:jc w:val="left"/>
+            </w:pPr>
+            <w:r>
+              <w:rPr>
+                <w:sz w:val="19"/>
+                <w:szCs w:val="19"/>
+              </w:rPr>
+              <w:t xml:space="preserve">Verified (external)</w:t>
+            </w:r>
+          </w:p>
+        </w:tc>
+        <w:tc>
+          <w:tcPr>
+            <w:tcW w:type="dxa" w:w="4026"/>
+            <w:tcBorders>
+              <w:top w:val="single" w:color="D9D7D0" w:sz="4"/>
+              <w:left w:val="single" w:color="D9D7D0" w:sz="4"/>
+              <w:bottom w:val="single" w:color="D9D7D0" w:sz="4"/>
+              <w:right w:val="single" w:color="D9D7D0" w:sz="4"/>
+            </w:tcBorders>
+            <w:shd w:fill="F7F7F5" w:color="auto" w:val="clear"/>
+            <w:tcMar>
+              <w:top w:type="dxa" w:w="70"/>
+              <w:left w:type="dxa" w:w="110"/>
+              <w:bottom w:type="dxa" w:w="70"/>
+              <w:right w:type="dxa" w:w="110"/>
+            </w:tcMar>
+          </w:tcPr>
+          <w:p>
+            <w:pPr>
+              <w:jc w:val="left"/>
+            </w:pPr>
+            <w:r>
+              <w:rPr>
+                <w:sz w:val="19"/>
+                <w:szCs w:val="19"/>
+              </w:rPr>
+              <w:t xml:space="preserve">The Business Standard, 15 Jun 2024 [7]</w:t>
+            </w:r>
+          </w:p>
+        </w:tc>
+      </w:tr>
+      <w:tr>
+        <w:tc>
+          <w:tcPr>
+            <w:tcW w:type="dxa" w:w="3300"/>
+            <w:tcBorders>
+              <w:top w:val="single" w:color="D9D7D0" w:sz="4"/>
+              <w:left w:val="single" w:color="D9D7D0" w:sz="4"/>
+              <w:bottom w:val="single" w:color="D9D7D0" w:sz="4"/>
+              <w:right w:val="single" w:color="D9D7D0" w:sz="4"/>
+            </w:tcBorders>
+            <w:tcMar>
+              <w:top w:type="dxa" w:w="70"/>
+              <w:left w:type="dxa" w:w="110"/>
+              <w:bottom w:type="dxa" w:w="70"/>
+              <w:right w:type="dxa" w:w="110"/>
+            </w:tcMar>
+          </w:tcPr>
+          <w:p>
+            <w:pPr>
+              <w:jc w:val="left"/>
+            </w:pPr>
+            <w:r>
+              <w:rPr>
+                <w:sz w:val="19"/>
+                <w:szCs w:val="19"/>
+              </w:rPr>
+              <w:t xml:space="preserve">upay cash-out fee: 1.4% primary, 1.0% salary, 1.0% remittance, 0.7% disbursement wallet</w:t>
+            </w:r>
+          </w:p>
+        </w:tc>
+        <w:tc>
+          <w:tcPr>
+            <w:tcW w:type="dxa" w:w="1700"/>
+            <w:tcBorders>
+              <w:top w:val="single" w:color="D9D7D0" w:sz="4"/>
+              <w:left w:val="single" w:color="D9D7D0" w:sz="4"/>
+              <w:bottom w:val="single" w:color="D9D7D0" w:sz="4"/>
+              <w:right w:val="single" w:color="D9D7D0" w:sz="4"/>
+            </w:tcBorders>
+            <w:tcMar>
+              <w:top w:type="dxa" w:w="70"/>
+              <w:left w:type="dxa" w:w="110"/>
+              <w:bottom w:type="dxa" w:w="70"/>
+              <w:right w:type="dxa" w:w="110"/>
+            </w:tcMar>
+          </w:tcPr>
+          <w:p>
+            <w:pPr>
+              <w:jc w:val="left"/>
+            </w:pPr>
+            <w:r>
+              <w:rPr>
+                <w:sz w:val="19"/>
+                <w:szCs w:val="19"/>
+              </w:rPr>
+              <w:t xml:space="preserve">Verified (external)</w:t>
+            </w:r>
+          </w:p>
+        </w:tc>
+        <w:tc>
+          <w:tcPr>
+            <w:tcW w:type="dxa" w:w="4026"/>
+            <w:tcBorders>
+              <w:top w:val="single" w:color="D9D7D0" w:sz="4"/>
+              <w:left w:val="single" w:color="D9D7D0" w:sz="4"/>
+              <w:bottom w:val="single" w:color="D9D7D0" w:sz="4"/>
+              <w:right w:val="single" w:color="D9D7D0" w:sz="4"/>
+            </w:tcBorders>
+            <w:tcMar>
+              <w:top w:type="dxa" w:w="70"/>
+              <w:left w:type="dxa" w:w="110"/>
+              <w:bottom w:type="dxa" w:w="70"/>
+              <w:right w:type="dxa" w:w="110"/>
+            </w:tcMar>
+          </w:tcPr>
+          <w:p>
+            <w:pPr>
+              <w:jc w:val="left"/>
+            </w:pPr>
+            <w:r>
+              <w:rPr>
+                <w:sz w:val="19"/>
+                <w:szCs w:val="19"/>
+              </w:rPr>
+              <w:t xml:space="preserve">upay website [8]; The Financial Express, 22 Apr 2021 [9] (1.4%)</w:t>
+            </w:r>
+          </w:p>
+        </w:tc>
+      </w:tr>
+      <w:tr>
+        <w:tc>
+          <w:tcPr>
+            <w:tcW w:type="dxa" w:w="3300"/>
+            <w:tcBorders>
+              <w:top w:val="single" w:color="D9D7D0" w:sz="4"/>
+              <w:left w:val="single" w:color="D9D7D0" w:sz="4"/>
+              <w:bottom w:val="single" w:color="D9D7D0" w:sz="4"/>
+              <w:right w:val="single" w:color="D9D7D0" w:sz="4"/>
+            </w:tcBorders>
+            <w:shd w:fill="F7F7F5" w:color="auto" w:val="clear"/>
+            <w:tcMar>
+              <w:top w:type="dxa" w:w="70"/>
+              <w:left w:type="dxa" w:w="110"/>
+              <w:bottom w:type="dxa" w:w="70"/>
+              <w:right w:type="dxa" w:w="110"/>
+            </w:tcMar>
+          </w:tcPr>
+          <w:p>
+            <w:pPr>
+              <w:jc w:val="left"/>
+            </w:pPr>
+            <w:r>
+              <w:rPr>
+                <w:sz w:val="19"/>
+                <w:szCs w:val="19"/>
+              </w:rPr>
+              <w:t xml:space="preserve">Agent commission 0.41% and distributor commission 0.10%</w:t>
+            </w:r>
+          </w:p>
+        </w:tc>
+        <w:tc>
+          <w:tcPr>
+            <w:tcW w:type="dxa" w:w="1700"/>
+            <w:tcBorders>
+              <w:top w:val="single" w:color="D9D7D0" w:sz="4"/>
+              <w:left w:val="single" w:color="D9D7D0" w:sz="4"/>
+              <w:bottom w:val="single" w:color="D9D7D0" w:sz="4"/>
+              <w:right w:val="single" w:color="D9D7D0" w:sz="4"/>
+            </w:tcBorders>
+            <w:shd w:fill="F7F7F5" w:color="auto" w:val="clear"/>
+            <w:tcMar>
+              <w:top w:type="dxa" w:w="70"/>
+              <w:left w:type="dxa" w:w="110"/>
+              <w:bottom w:type="dxa" w:w="70"/>
+              <w:right w:type="dxa" w:w="110"/>
+            </w:tcMar>
+          </w:tcPr>
+          <w:p>
+            <w:pPr>
+              <w:jc w:val="left"/>
+            </w:pPr>
+            <w:r>
+              <w:rPr>
+                <w:sz w:val="19"/>
+                <w:szCs w:val="19"/>
+              </w:rPr>
+              <w:t xml:space="preserve">Not re-confirmed</w:t>
+            </w:r>
+          </w:p>
+        </w:tc>
+        <w:tc>
+          <w:tcPr>
+            <w:tcW w:type="dxa" w:w="4026"/>
+            <w:tcBorders>
+              <w:top w:val="single" w:color="D9D7D0" w:sz="4"/>
+              <w:left w:val="single" w:color="D9D7D0" w:sz="4"/>
+              <w:bottom w:val="single" w:color="D9D7D0" w:sz="4"/>
+              <w:right w:val="single" w:color="D9D7D0" w:sz="4"/>
+            </w:tcBorders>
+            <w:shd w:fill="F7F7F5" w:color="auto" w:val="clear"/>
+            <w:tcMar>
+              <w:top w:type="dxa" w:w="70"/>
+              <w:left w:type="dxa" w:w="110"/>
+              <w:bottom w:type="dxa" w:w="70"/>
+              <w:right w:type="dxa" w:w="110"/>
+            </w:tcMar>
+          </w:tcPr>
+          <w:p>
+            <w:pPr>
+              <w:jc w:val="left"/>
+            </w:pPr>
+            <w:r>
+              <w:rPr>
+                <w:sz w:val="19"/>
+                <w:szCs w:val="19"/>
+              </w:rPr>
+              <w:t xml:space="preserve">Taken from upay agent information when the data was built; the page no longer shows the rates. Verify with upay. Affects the commission figures and upay's net fee (fee − 0.51%)</w:t>
+            </w:r>
+          </w:p>
+        </w:tc>
+      </w:tr>
+      <w:tr>
+        <w:tc>
+          <w:tcPr>
+            <w:tcW w:type="dxa" w:w="3300"/>
+            <w:tcBorders>
+              <w:top w:val="single" w:color="D9D7D0" w:sz="4"/>
+              <w:left w:val="single" w:color="D9D7D0" w:sz="4"/>
+              <w:bottom w:val="single" w:color="D9D7D0" w:sz="4"/>
+              <w:right w:val="single" w:color="D9D7D0" w:sz="4"/>
+            </w:tcBorders>
+            <w:tcMar>
+              <w:top w:type="dxa" w:w="70"/>
+              <w:left w:type="dxa" w:w="110"/>
+              <w:bottom w:type="dxa" w:w="70"/>
+              <w:right w:type="dxa" w:w="110"/>
+            </w:tcMar>
+          </w:tcPr>
+          <w:p>
+            <w:pPr>
+              <w:jc w:val="left"/>
+            </w:pPr>
+            <w:r>
+              <w:rPr>
+                <w:sz w:val="19"/>
+                <w:szCs w:val="19"/>
+              </w:rPr>
+              <w:t xml:space="preserve">Customer cash-out limit Tk 25,000 per transaction</w:t>
+            </w:r>
+          </w:p>
+        </w:tc>
+        <w:tc>
+          <w:tcPr>
+            <w:tcW w:type="dxa" w:w="1700"/>
+            <w:tcBorders>
+              <w:top w:val="single" w:color="D9D7D0" w:sz="4"/>
+              <w:left w:val="single" w:color="D9D7D0" w:sz="4"/>
+              <w:bottom w:val="single" w:color="D9D7D0" w:sz="4"/>
+              <w:right w:val="single" w:color="D9D7D0" w:sz="4"/>
+            </w:tcBorders>
+            <w:tcMar>
+              <w:top w:type="dxa" w:w="70"/>
+              <w:left w:type="dxa" w:w="110"/>
+              <w:bottom w:type="dxa" w:w="70"/>
+              <w:right w:type="dxa" w:w="110"/>
+            </w:tcMar>
+          </w:tcPr>
+          <w:p>
+            <w:pPr>
+              <w:jc w:val="left"/>
+            </w:pPr>
+            <w:r>
+              <w:rPr>
+                <w:sz w:val="19"/>
+                <w:szCs w:val="19"/>
+              </w:rPr>
+              <w:t xml:space="preserve">Not re-confirmed</w:t>
+            </w:r>
+          </w:p>
+        </w:tc>
+        <w:tc>
+          <w:tcPr>
+            <w:tcW w:type="dxa" w:w="4026"/>
+            <w:tcBorders>
+              <w:top w:val="single" w:color="D9D7D0" w:sz="4"/>
+              <w:left w:val="single" w:color="D9D7D0" w:sz="4"/>
+              <w:bottom w:val="single" w:color="D9D7D0" w:sz="4"/>
+              <w:right w:val="single" w:color="D9D7D0" w:sz="4"/>
+            </w:tcBorders>
+            <w:tcMar>
+              <w:top w:type="dxa" w:w="70"/>
+              <w:left w:type="dxa" w:w="110"/>
+              <w:bottom w:type="dxa" w:w="70"/>
+              <w:right w:type="dxa" w:w="110"/>
+            </w:tcMar>
+          </w:tcPr>
+          <w:p>
+            <w:pPr>
+              <w:jc w:val="left"/>
+            </w:pPr>
+            <w:r>
+              <w:rPr>
+                <w:sz w:val="19"/>
+                <w:szCs w:val="19"/>
+              </w:rPr>
+              <w:t xml:space="preserve">From upay's limits and charges document (UCB); the file could not be downloaded during this check</w:t>
+            </w:r>
+          </w:p>
+        </w:tc>
+      </w:tr>
+      <w:tr>
+        <w:tc>
+          <w:tcPr>
+            <w:tcW w:type="dxa" w:w="3300"/>
+            <w:tcBorders>
+              <w:top w:val="single" w:color="D9D7D0" w:sz="4"/>
+              <w:left w:val="single" w:color="D9D7D0" w:sz="4"/>
+              <w:bottom w:val="single" w:color="D9D7D0" w:sz="4"/>
+              <w:right w:val="single" w:color="D9D7D0" w:sz="4"/>
+            </w:tcBorders>
+            <w:shd w:fill="F7F7F5" w:color="auto" w:val="clear"/>
+            <w:tcMar>
+              <w:top w:type="dxa" w:w="70"/>
+              <w:left w:type="dxa" w:w="110"/>
+              <w:bottom w:type="dxa" w:w="70"/>
+              <w:right w:type="dxa" w:w="110"/>
+            </w:tcMar>
+          </w:tcPr>
+          <w:p>
+            <w:pPr>
+              <w:jc w:val="left"/>
+            </w:pPr>
+            <w:r>
+              <w:rPr>
+                <w:sz w:val="19"/>
+                <w:szCs w:val="19"/>
+              </w:rPr>
+              <w:t xml:space="preserve">Eid dates 2024 and 2025 used in the data</w:t>
+            </w:r>
+          </w:p>
+        </w:tc>
+        <w:tc>
+          <w:tcPr>
+            <w:tcW w:type="dxa" w:w="1700"/>
+            <w:tcBorders>
+              <w:top w:val="single" w:color="D9D7D0" w:sz="4"/>
+              <w:left w:val="single" w:color="D9D7D0" w:sz="4"/>
+              <w:bottom w:val="single" w:color="D9D7D0" w:sz="4"/>
+              <w:right w:val="single" w:color="D9D7D0" w:sz="4"/>
+            </w:tcBorders>
+            <w:shd w:fill="F7F7F5" w:color="auto" w:val="clear"/>
+            <w:tcMar>
+              <w:top w:type="dxa" w:w="70"/>
+              <w:left w:type="dxa" w:w="110"/>
+              <w:bottom w:type="dxa" w:w="70"/>
+              <w:right w:type="dxa" w:w="110"/>
+            </w:tcMar>
+          </w:tcPr>
+          <w:p>
+            <w:pPr>
+              <w:jc w:val="left"/>
+            </w:pPr>
+            <w:r>
+              <w:rPr>
+                <w:sz w:val="19"/>
+                <w:szCs w:val="19"/>
+              </w:rPr>
+              <w:t xml:space="preserve">Verified (external)</w:t>
+            </w:r>
+          </w:p>
+        </w:tc>
+        <w:tc>
+          <w:tcPr>
+            <w:tcW w:type="dxa" w:w="4026"/>
+            <w:tcBorders>
+              <w:top w:val="single" w:color="D9D7D0" w:sz="4"/>
+              <w:left w:val="single" w:color="D9D7D0" w:sz="4"/>
+              <w:bottom w:val="single" w:color="D9D7D0" w:sz="4"/>
+              <w:right w:val="single" w:color="D9D7D0" w:sz="4"/>
+            </w:tcBorders>
+            <w:shd w:fill="F7F7F5" w:color="auto" w:val="clear"/>
+            <w:tcMar>
+              <w:top w:type="dxa" w:w="70"/>
+              <w:left w:type="dxa" w:w="110"/>
+              <w:bottom w:type="dxa" w:w="70"/>
+              <w:right w:type="dxa" w:w="110"/>
+            </w:tcMar>
+          </w:tcPr>
+          <w:p>
+            <w:pPr>
+              <w:jc w:val="left"/>
+            </w:pPr>
+            <w:r>
+              <w:rPr>
+                <w:sz w:val="19"/>
+                <w:szCs w:val="19"/>
+              </w:rPr>
+              <w:t xml:space="preserve">Match the published Bangladesh holiday dates</w:t>
+            </w:r>
+          </w:p>
+        </w:tc>
+      </w:tr>
+      <w:tr>
+        <w:tc>
+          <w:tcPr>
+            <w:tcW w:type="dxa" w:w="3300"/>
+            <w:tcBorders>
+              <w:top w:val="single" w:color="D9D7D0" w:sz="4"/>
+              <w:left w:val="single" w:color="D9D7D0" w:sz="4"/>
+              <w:bottom w:val="single" w:color="D9D7D0" w:sz="4"/>
+              <w:right w:val="single" w:color="D9D7D0" w:sz="4"/>
+            </w:tcBorders>
+            <w:tcMar>
+              <w:top w:type="dxa" w:w="70"/>
+              <w:left w:type="dxa" w:w="110"/>
+              <w:bottom w:type="dxa" w:w="70"/>
+              <w:right w:type="dxa" w:w="110"/>
+            </w:tcMar>
+          </w:tcPr>
+          <w:p>
+            <w:pPr>
+              <w:jc w:val="left"/>
+            </w:pPr>
+            <w:r>
+              <w:rPr>
+                <w:sz w:val="19"/>
+                <w:szCs w:val="19"/>
+              </w:rPr>
+              <w:t xml:space="preserve">Eid-ul-Fitr 20 March 2026 and Eid-ul-Adha 27 May 2026 used in the data</w:t>
+            </w:r>
+          </w:p>
+        </w:tc>
+        <w:tc>
+          <w:tcPr>
+            <w:tcW w:type="dxa" w:w="1700"/>
+            <w:tcBorders>
+              <w:top w:val="single" w:color="D9D7D0" w:sz="4"/>
+              <w:left w:val="single" w:color="D9D7D0" w:sz="4"/>
+              <w:bottom w:val="single" w:color="D9D7D0" w:sz="4"/>
+              <w:right w:val="single" w:color="D9D7D0" w:sz="4"/>
+            </w:tcBorders>
+            <w:tcMar>
+              <w:top w:type="dxa" w:w="70"/>
+              <w:left w:type="dxa" w:w="110"/>
+              <w:bottom w:type="dxa" w:w="70"/>
+              <w:right w:type="dxa" w:w="110"/>
+            </w:tcMar>
+          </w:tcPr>
+          <w:p>
+            <w:pPr>
+              <w:jc w:val="left"/>
+            </w:pPr>
+            <w:r>
+              <w:rPr>
+                <w:sz w:val="19"/>
+                <w:szCs w:val="19"/>
+              </w:rPr>
+              <w:t xml:space="preserve">Discrepancy</w:t>
+            </w:r>
+          </w:p>
+        </w:tc>
+        <w:tc>
+          <w:tcPr>
+            <w:tcW w:type="dxa" w:w="4026"/>
+            <w:tcBorders>
+              <w:top w:val="single" w:color="D9D7D0" w:sz="4"/>
+              <w:left w:val="single" w:color="D9D7D0" w:sz="4"/>
+              <w:bottom w:val="single" w:color="D9D7D0" w:sz="4"/>
+              <w:right w:val="single" w:color="D9D7D0" w:sz="4"/>
+            </w:tcBorders>
+            <w:tcMar>
+              <w:top w:type="dxa" w:w="70"/>
+              <w:left w:type="dxa" w:w="110"/>
+              <w:bottom w:type="dxa" w:w="70"/>
+              <w:right w:type="dxa" w:w="110"/>
+            </w:tcMar>
+          </w:tcPr>
+          <w:p>
+            <w:pPr>
+              <w:jc w:val="left"/>
+            </w:pPr>
+            <w:r>
+              <w:rPr>
+                <w:sz w:val="19"/>
+                <w:szCs w:val="19"/>
+              </w:rPr>
+              <w:t xml:space="preserve">Bangladesh celebrated on 21 March [12] and 28 May 2026 [13], one day later. The dates were set before the moons were sighted. Because the data is synthetic the results are internally consistent, but the 2026 calendar should be corrected (one line in config.yaml) and the pipeline re-run before a real pilot</w:t>
+            </w:r>
+          </w:p>
+        </w:tc>
+      </w:tr>
+      <w:tr>
+        <w:tc>
+          <w:tcPr>
+            <w:tcW w:type="dxa" w:w="3300"/>
+            <w:tcBorders>
+              <w:top w:val="single" w:color="D9D7D0" w:sz="4"/>
+              <w:left w:val="single" w:color="D9D7D0" w:sz="4"/>
+              <w:bottom w:val="single" w:color="D9D7D0" w:sz="4"/>
+              <w:right w:val="single" w:color="D9D7D0" w:sz="4"/>
+            </w:tcBorders>
+            <w:shd w:fill="F7F7F5" w:color="auto" w:val="clear"/>
+            <w:tcMar>
+              <w:top w:type="dxa" w:w="70"/>
+              <w:left w:type="dxa" w:w="110"/>
+              <w:bottom w:type="dxa" w:w="70"/>
+              <w:right w:type="dxa" w:w="110"/>
+            </w:tcMar>
+          </w:tcPr>
+          <w:p>
+            <w:pPr>
+              <w:jc w:val="left"/>
+            </w:pPr>
+            <w:r>
+              <w:rPr>
+                <w:sz w:val="19"/>
+                <w:szCs w:val="19"/>
+              </w:rPr>
+              <w:t xml:space="preserve">Eid moves 10–11 days earlier each year</w:t>
+            </w:r>
+          </w:p>
+        </w:tc>
+        <w:tc>
+          <w:tcPr>
+            <w:tcW w:type="dxa" w:w="1700"/>
+            <w:tcBorders>
+              <w:top w:val="single" w:color="D9D7D0" w:sz="4"/>
+              <w:left w:val="single" w:color="D9D7D0" w:sz="4"/>
+              <w:bottom w:val="single" w:color="D9D7D0" w:sz="4"/>
+              <w:right w:val="single" w:color="D9D7D0" w:sz="4"/>
+            </w:tcBorders>
+            <w:shd w:fill="F7F7F5" w:color="auto" w:val="clear"/>
+            <w:tcMar>
+              <w:top w:type="dxa" w:w="70"/>
+              <w:left w:type="dxa" w:w="110"/>
+              <w:bottom w:type="dxa" w:w="70"/>
+              <w:right w:type="dxa" w:w="110"/>
+            </w:tcMar>
+          </w:tcPr>
+          <w:p>
+            <w:pPr>
+              <w:jc w:val="left"/>
+            </w:pPr>
+            <w:r>
+              <w:rPr>
+                <w:sz w:val="19"/>
+                <w:szCs w:val="19"/>
+              </w:rPr>
+              <w:t xml:space="preserve">Verified (external)</w:t>
+            </w:r>
+          </w:p>
+        </w:tc>
+        <w:tc>
+          <w:tcPr>
+            <w:tcW w:type="dxa" w:w="4026"/>
+            <w:tcBorders>
+              <w:top w:val="single" w:color="D9D7D0" w:sz="4"/>
+              <w:left w:val="single" w:color="D9D7D0" w:sz="4"/>
+              <w:bottom w:val="single" w:color="D9D7D0" w:sz="4"/>
+              <w:right w:val="single" w:color="D9D7D0" w:sz="4"/>
+            </w:tcBorders>
+            <w:shd w:fill="F7F7F5" w:color="auto" w:val="clear"/>
+            <w:tcMar>
+              <w:top w:type="dxa" w:w="70"/>
+              <w:left w:type="dxa" w:w="110"/>
+              <w:bottom w:type="dxa" w:w="70"/>
+              <w:right w:type="dxa" w:w="110"/>
+            </w:tcMar>
+          </w:tcPr>
+          <w:p>
+            <w:pPr>
+              <w:jc w:val="left"/>
+            </w:pPr>
+            <w:r>
+              <w:rPr>
+                <w:sz w:val="19"/>
+                <w:szCs w:val="19"/>
+              </w:rPr>
+              <w:t xml:space="preserve">Follows from the dates above [12]</w:t>
+            </w:r>
+          </w:p>
+        </w:tc>
+      </w:tr>
+    </w:tbl>
+    <w:p>
+      <w:pPr>
+        <w:spacing w:after="60"/>
+      </w:pPr>
+    </w:p>
+    <w:p>
+      <w:pPr>
+        <w:pStyle w:val="Heading2"/>
+      </w:pPr>
+      <w:r>
+        <w:t xml:space="preserve">15.2 Assumptions without a public source</w:t>
+      </w:r>
+    </w:p>
+    <w:tbl>
+      <w:tblPr>
+        <w:tblW w:type="dxa" w:w="9026"/>
+        <w:tblBorders>
+          <w:top w:val="single" w:color="auto" w:sz="4"/>
+          <w:left w:val="single" w:color="auto" w:sz="4"/>
+          <w:bottom w:val="single" w:color="auto" w:sz="4"/>
+          <w:right w:val="single" w:color="auto" w:sz="4"/>
+          <w:insideH w:val="single" w:color="auto" w:sz="4"/>
+          <w:insideV w:val="single" w:color="auto" w:sz="4"/>
+        </w:tblBorders>
+      </w:tblPr>
+      <w:tblGrid>
+        <w:gridCol w:w="3300"/>
+        <w:gridCol w:w="2500"/>
+        <w:gridCol w:w="3226"/>
+      </w:tblGrid>
+      <w:tr>
+        <w:trPr>
+          <w:tblHeader/>
+        </w:trPr>
+        <w:tc>
+          <w:tcPr>
+            <w:tcW w:type="dxa" w:w="3300"/>
+            <w:tcBorders>
+              <w:top w:val="single" w:color="D9D7D0" w:sz="4"/>
+              <w:left w:val="single" w:color="D9D7D0" w:sz="4"/>
+              <w:bottom w:val="single" w:color="D9D7D0" w:sz="4"/>
+              <w:right w:val="single" w:color="D9D7D0" w:sz="4"/>
+            </w:tcBorders>
+            <w:shd w:fill="1F3B57" w:color="auto" w:val="clear"/>
+            <w:tcMar>
+              <w:top w:type="dxa" w:w="70"/>
+              <w:left w:type="dxa" w:w="110"/>
+              <w:bottom w:type="dxa" w:w="70"/>
+              <w:right w:type="dxa" w:w="110"/>
+            </w:tcMar>
+          </w:tcPr>
+          <w:p>
+            <w:pPr>
+              <w:jc w:val="left"/>
+            </w:pPr>
+            <w:r>
+              <w:rPr>
+                <w:b/>
+                <w:bCs/>
+                <w:color w:val="FFFFFF"/>
+                <w:sz w:val="19"/>
+                <w:szCs w:val="19"/>
+              </w:rPr>
+              <w:t xml:space="preserve">Assumption</w:t>
+            </w:r>
+          </w:p>
+        </w:tc>
+        <w:tc>
+          <w:tcPr>
+            <w:tcW w:type="dxa" w:w="2500"/>
+            <w:tcBorders>
+              <w:top w:val="single" w:color="D9D7D0" w:sz="4"/>
+              <w:left w:val="single" w:color="D9D7D0" w:sz="4"/>
+              <w:bottom w:val="single" w:color="D9D7D0" w:sz="4"/>
+              <w:right w:val="single" w:color="D9D7D0" w:sz="4"/>
+            </w:tcBorders>
+            <w:shd w:fill="1F3B57" w:color="auto" w:val="clear"/>
+            <w:tcMar>
+              <w:top w:type="dxa" w:w="70"/>
+              <w:left w:type="dxa" w:w="110"/>
+              <w:bottom w:type="dxa" w:w="70"/>
+              <w:right w:type="dxa" w:w="110"/>
+            </w:tcMar>
+          </w:tcPr>
+          <w:p>
+            <w:pPr>
+              <w:jc w:val="left"/>
+            </w:pPr>
+            <w:r>
+              <w:rPr>
+                <w:b/>
+                <w:bCs/>
+                <w:color w:val="FFFFFF"/>
+                <w:sz w:val="19"/>
+                <w:szCs w:val="19"/>
+              </w:rPr>
+              <w:t xml:space="preserve">Value</w:t>
+            </w:r>
+          </w:p>
+        </w:tc>
+        <w:tc>
+          <w:tcPr>
+            <w:tcW w:type="dxa" w:w="3226"/>
+            <w:tcBorders>
+              <w:top w:val="single" w:color="D9D7D0" w:sz="4"/>
+              <w:left w:val="single" w:color="D9D7D0" w:sz="4"/>
+              <w:bottom w:val="single" w:color="D9D7D0" w:sz="4"/>
+              <w:right w:val="single" w:color="D9D7D0" w:sz="4"/>
+            </w:tcBorders>
+            <w:shd w:fill="1F3B57" w:color="auto" w:val="clear"/>
+            <w:tcMar>
+              <w:top w:type="dxa" w:w="70"/>
+              <w:left w:type="dxa" w:w="110"/>
+              <w:bottom w:type="dxa" w:w="70"/>
+              <w:right w:type="dxa" w:w="110"/>
+            </w:tcMar>
+          </w:tcPr>
+          <w:p>
+            <w:pPr>
+              <w:jc w:val="left"/>
+            </w:pPr>
+            <w:r>
+              <w:rPr>
+                <w:b/>
+                <w:bCs/>
+                <w:color w:val="FFFFFF"/>
+                <w:sz w:val="19"/>
+                <w:szCs w:val="19"/>
+              </w:rPr>
+              <w:t xml:space="preserve">Why it is reasonable</w:t>
+            </w:r>
+          </w:p>
+        </w:tc>
+      </w:tr>
+      <w:tr>
+        <w:tc>
+          <w:tcPr>
+            <w:tcW w:type="dxa" w:w="3300"/>
+            <w:tcBorders>
+              <w:top w:val="single" w:color="D9D7D0" w:sz="4"/>
+              <w:left w:val="single" w:color="D9D7D0" w:sz="4"/>
+              <w:bottom w:val="single" w:color="D9D7D0" w:sz="4"/>
+              <w:right w:val="single" w:color="D9D7D0" w:sz="4"/>
+            </w:tcBorders>
+            <w:tcMar>
+              <w:top w:type="dxa" w:w="70"/>
+              <w:left w:type="dxa" w:w="110"/>
+              <w:bottom w:type="dxa" w:w="70"/>
+              <w:right w:type="dxa" w:w="110"/>
+            </w:tcMar>
+          </w:tcPr>
+          <w:p>
+            <w:pPr>
+              <w:jc w:val="left"/>
+            </w:pPr>
+            <w:r>
+              <w:rPr>
+                <w:sz w:val="19"/>
+                <w:szCs w:val="19"/>
+              </w:rPr>
+              <w:t xml:space="preserve">Daily volumes per agent and area-type mix</w:t>
+            </w:r>
+          </w:p>
+        </w:tc>
+        <w:tc>
+          <w:tcPr>
+            <w:tcW w:type="dxa" w:w="2500"/>
+            <w:tcBorders>
+              <w:top w:val="single" w:color="D9D7D0" w:sz="4"/>
+              <w:left w:val="single" w:color="D9D7D0" w:sz="4"/>
+              <w:bottom w:val="single" w:color="D9D7D0" w:sz="4"/>
+              <w:right w:val="single" w:color="D9D7D0" w:sz="4"/>
+            </w:tcBorders>
+            <w:tcMar>
+              <w:top w:type="dxa" w:w="70"/>
+              <w:left w:type="dxa" w:w="110"/>
+              <w:bottom w:type="dxa" w:w="70"/>
+              <w:right w:type="dxa" w:w="110"/>
+            </w:tcMar>
+          </w:tcPr>
+          <w:p>
+            <w:pPr>
+              <w:jc w:val="left"/>
+            </w:pPr>
+            <w:r>
+              <w:rPr>
+                <w:sz w:val="19"/>
+                <w:szCs w:val="19"/>
+              </w:rPr>
+              <w:t xml:space="preserve">Tk 60,000 – 3,00,000 cash-out per day by archetype</w:t>
+            </w:r>
+          </w:p>
+        </w:tc>
+        <w:tc>
+          <w:tcPr>
+            <w:tcW w:type="dxa" w:w="3226"/>
+            <w:tcBorders>
+              <w:top w:val="single" w:color="D9D7D0" w:sz="4"/>
+              <w:left w:val="single" w:color="D9D7D0" w:sz="4"/>
+              <w:bottom w:val="single" w:color="D9D7D0" w:sz="4"/>
+              <w:right w:val="single" w:color="D9D7D0" w:sz="4"/>
+            </w:tcBorders>
+            <w:tcMar>
+              <w:top w:type="dxa" w:w="70"/>
+              <w:left w:type="dxa" w:w="110"/>
+              <w:bottom w:type="dxa" w:w="70"/>
+              <w:right w:type="dxa" w:w="110"/>
+            </w:tcMar>
+          </w:tcPr>
+          <w:p>
+            <w:pPr>
+              <w:jc w:val="left"/>
+            </w:pPr>
+            <w:r>
+              <w:rPr>
+                <w:sz w:val="19"/>
+                <w:szCs w:val="19"/>
+              </w:rPr>
+              <w:t xml:space="preserve">Shapes follow the sources in 2.4; levels are illustrative</w:t>
+            </w:r>
+          </w:p>
+        </w:tc>
+      </w:tr>
+      <w:tr>
+        <w:tc>
+          <w:tcPr>
+            <w:tcW w:type="dxa" w:w="3300"/>
+            <w:tcBorders>
+              <w:top w:val="single" w:color="D9D7D0" w:sz="4"/>
+              <w:left w:val="single" w:color="D9D7D0" w:sz="4"/>
+              <w:bottom w:val="single" w:color="D9D7D0" w:sz="4"/>
+              <w:right w:val="single" w:color="D9D7D0" w:sz="4"/>
+            </w:tcBorders>
+            <w:shd w:fill="F7F7F5" w:color="auto" w:val="clear"/>
+            <w:tcMar>
+              <w:top w:type="dxa" w:w="70"/>
+              <w:left w:type="dxa" w:w="110"/>
+              <w:bottom w:type="dxa" w:w="70"/>
+              <w:right w:type="dxa" w:w="110"/>
+            </w:tcMar>
+          </w:tcPr>
+          <w:p>
+            <w:pPr>
+              <w:jc w:val="left"/>
+            </w:pPr>
+            <w:r>
+              <w:rPr>
+                <w:sz w:val="19"/>
+                <w:szCs w:val="19"/>
+              </w:rPr>
+              <w:t xml:space="preserve">Eid, salary and allowance multipliers</w:t>
+            </w:r>
+          </w:p>
+        </w:tc>
+        <w:tc>
+          <w:tcPr>
+            <w:tcW w:type="dxa" w:w="2500"/>
+            <w:tcBorders>
+              <w:top w:val="single" w:color="D9D7D0" w:sz="4"/>
+              <w:left w:val="single" w:color="D9D7D0" w:sz="4"/>
+              <w:bottom w:val="single" w:color="D9D7D0" w:sz="4"/>
+              <w:right w:val="single" w:color="D9D7D0" w:sz="4"/>
+            </w:tcBorders>
+            <w:shd w:fill="F7F7F5" w:color="auto" w:val="clear"/>
+            <w:tcMar>
+              <w:top w:type="dxa" w:w="70"/>
+              <w:left w:type="dxa" w:w="110"/>
+              <w:bottom w:type="dxa" w:w="70"/>
+              <w:right w:type="dxa" w:w="110"/>
+            </w:tcMar>
+          </w:tcPr>
+          <w:p>
+            <w:pPr>
+              <w:jc w:val="left"/>
+            </w:pPr>
+            <w:r>
+              <w:rPr>
+                <w:sz w:val="19"/>
+                <w:szCs w:val="19"/>
+              </w:rPr>
+              <w:t xml:space="preserve">e.g. rural cash-out up to ×2.6 before Eid-ul-Fitr</w:t>
+            </w:r>
+          </w:p>
+        </w:tc>
+        <w:tc>
+          <w:tcPr>
+            <w:tcW w:type="dxa" w:w="3226"/>
+            <w:tcBorders>
+              <w:top w:val="single" w:color="D9D7D0" w:sz="4"/>
+              <w:left w:val="single" w:color="D9D7D0" w:sz="4"/>
+              <w:bottom w:val="single" w:color="D9D7D0" w:sz="4"/>
+              <w:right w:val="single" w:color="D9D7D0" w:sz="4"/>
+            </w:tcBorders>
+            <w:shd w:fill="F7F7F5" w:color="auto" w:val="clear"/>
+            <w:tcMar>
+              <w:top w:type="dxa" w:w="70"/>
+              <w:left w:type="dxa" w:w="110"/>
+              <w:bottom w:type="dxa" w:w="70"/>
+              <w:right w:type="dxa" w:w="110"/>
+            </w:tcMar>
+          </w:tcPr>
+          <w:p>
+            <w:pPr>
+              <w:jc w:val="left"/>
+            </w:pPr>
+            <w:r>
+              <w:rPr>
+                <w:sz w:val="19"/>
+                <w:szCs w:val="19"/>
+              </w:rPr>
+              <w:t xml:space="preserve">Direction supported by [1]–[6], [10]; size not published</w:t>
+            </w:r>
+          </w:p>
+        </w:tc>
+      </w:tr>
+      <w:tr>
+        <w:tc>
+          <w:tcPr>
+            <w:tcW w:type="dxa" w:w="3300"/>
+            <w:tcBorders>
+              <w:top w:val="single" w:color="D9D7D0" w:sz="4"/>
+              <w:left w:val="single" w:color="D9D7D0" w:sz="4"/>
+              <w:bottom w:val="single" w:color="D9D7D0" w:sz="4"/>
+              <w:right w:val="single" w:color="D9D7D0" w:sz="4"/>
+            </w:tcBorders>
+            <w:tcMar>
+              <w:top w:type="dxa" w:w="70"/>
+              <w:left w:type="dxa" w:w="110"/>
+              <w:bottom w:type="dxa" w:w="70"/>
+              <w:right w:type="dxa" w:w="110"/>
+            </w:tcMar>
+          </w:tcPr>
+          <w:p>
+            <w:pPr>
+              <w:jc w:val="left"/>
+            </w:pPr>
+            <w:r>
+              <w:rPr>
+                <w:sz w:val="19"/>
+                <w:szCs w:val="19"/>
+              </w:rPr>
+              <w:t xml:space="preserve">Stockout rates under today's rule (30% pre-Eid, 1.6% normal)</w:t>
+            </w:r>
+          </w:p>
+        </w:tc>
+        <w:tc>
+          <w:tcPr>
+            <w:tcW w:type="dxa" w:w="2500"/>
+            <w:tcBorders>
+              <w:top w:val="single" w:color="D9D7D0" w:sz="4"/>
+              <w:left w:val="single" w:color="D9D7D0" w:sz="4"/>
+              <w:bottom w:val="single" w:color="D9D7D0" w:sz="4"/>
+              <w:right w:val="single" w:color="D9D7D0" w:sz="4"/>
+            </w:tcBorders>
+            <w:tcMar>
+              <w:top w:type="dxa" w:w="70"/>
+              <w:left w:type="dxa" w:w="110"/>
+              <w:bottom w:type="dxa" w:w="70"/>
+              <w:right w:type="dxa" w:w="110"/>
+            </w:tcMar>
+          </w:tcPr>
+          <w:p>
+            <w:pPr>
+              <w:jc w:val="left"/>
+            </w:pPr>
+            <w:r>
+              <w:rPr>
+                <w:sz w:val="19"/>
+                <w:szCs w:val="19"/>
+              </w:rPr>
+              <w:t xml:space="preserve">Output of the synthetic ledger</w:t>
+            </w:r>
+          </w:p>
+        </w:tc>
+        <w:tc>
+          <w:tcPr>
+            <w:tcW w:type="dxa" w:w="3226"/>
+            <w:tcBorders>
+              <w:top w:val="single" w:color="D9D7D0" w:sz="4"/>
+              <w:left w:val="single" w:color="D9D7D0" w:sz="4"/>
+              <w:bottom w:val="single" w:color="D9D7D0" w:sz="4"/>
+              <w:right w:val="single" w:color="D9D7D0" w:sz="4"/>
+            </w:tcBorders>
+            <w:tcMar>
+              <w:top w:type="dxa" w:w="70"/>
+              <w:left w:type="dxa" w:w="110"/>
+              <w:bottom w:type="dxa" w:w="70"/>
+              <w:right w:type="dxa" w:w="110"/>
+            </w:tcMar>
+          </w:tcPr>
+          <w:p>
+            <w:pPr>
+              <w:jc w:val="left"/>
+            </w:pPr>
+            <w:r>
+              <w:rPr>
+                <w:sz w:val="19"/>
+                <w:szCs w:val="19"/>
+              </w:rPr>
+              <w:t xml:space="preserve">No public agent stockout statistics exist</w:t>
+            </w:r>
+          </w:p>
+        </w:tc>
+      </w:tr>
+      <w:tr>
+        <w:tc>
+          <w:tcPr>
+            <w:tcW w:type="dxa" w:w="3300"/>
+            <w:tcBorders>
+              <w:top w:val="single" w:color="D9D7D0" w:sz="4"/>
+              <w:left w:val="single" w:color="D9D7D0" w:sz="4"/>
+              <w:bottom w:val="single" w:color="D9D7D0" w:sz="4"/>
+              <w:right w:val="single" w:color="D9D7D0" w:sz="4"/>
+            </w:tcBorders>
+            <w:shd w:fill="F7F7F5" w:color="auto" w:val="clear"/>
+            <w:tcMar>
+              <w:top w:type="dxa" w:w="70"/>
+              <w:left w:type="dxa" w:w="110"/>
+              <w:bottom w:type="dxa" w:w="70"/>
+              <w:right w:type="dxa" w:w="110"/>
+            </w:tcMar>
+          </w:tcPr>
+          <w:p>
+            <w:pPr>
+              <w:jc w:val="left"/>
+            </w:pPr>
+            <w:r>
+              <w:rPr>
+                <w:sz w:val="19"/>
+                <w:szCs w:val="19"/>
+              </w:rPr>
+              <w:t xml:space="preserve">Today's rule of thumb (top up to 1.5× the 7-day average below 0.6×)</w:t>
+            </w:r>
+          </w:p>
+        </w:tc>
+        <w:tc>
+          <w:tcPr>
+            <w:tcW w:type="dxa" w:w="2500"/>
+            <w:tcBorders>
+              <w:top w:val="single" w:color="D9D7D0" w:sz="4"/>
+              <w:left w:val="single" w:color="D9D7D0" w:sz="4"/>
+              <w:bottom w:val="single" w:color="D9D7D0" w:sz="4"/>
+              <w:right w:val="single" w:color="D9D7D0" w:sz="4"/>
+            </w:tcBorders>
+            <w:shd w:fill="F7F7F5" w:color="auto" w:val="clear"/>
+            <w:tcMar>
+              <w:top w:type="dxa" w:w="70"/>
+              <w:left w:type="dxa" w:w="110"/>
+              <w:bottom w:type="dxa" w:w="70"/>
+              <w:right w:type="dxa" w:w="110"/>
+            </w:tcMar>
+          </w:tcPr>
+          <w:p>
+            <w:pPr>
+              <w:jc w:val="left"/>
+            </w:pPr>
+            <w:r>
+              <w:rPr>
+                <w:sz w:val="19"/>
+                <w:szCs w:val="19"/>
+              </w:rPr>
+              <w:t xml:space="preserve">Modelled behaviour</w:t>
+            </w:r>
+          </w:p>
+        </w:tc>
+        <w:tc>
+          <w:tcPr>
+            <w:tcW w:type="dxa" w:w="3226"/>
+            <w:tcBorders>
+              <w:top w:val="single" w:color="D9D7D0" w:sz="4"/>
+              <w:left w:val="single" w:color="D9D7D0" w:sz="4"/>
+              <w:bottom w:val="single" w:color="D9D7D0" w:sz="4"/>
+              <w:right w:val="single" w:color="D9D7D0" w:sz="4"/>
+            </w:tcBorders>
+            <w:shd w:fill="F7F7F5" w:color="auto" w:val="clear"/>
+            <w:tcMar>
+              <w:top w:type="dxa" w:w="70"/>
+              <w:left w:type="dxa" w:w="110"/>
+              <w:bottom w:type="dxa" w:w="70"/>
+              <w:right w:type="dxa" w:w="110"/>
+            </w:tcMar>
+          </w:tcPr>
+          <w:p>
+            <w:pPr>
+              <w:jc w:val="left"/>
+            </w:pPr>
+            <w:r>
+              <w:rPr>
+                <w:sz w:val="19"/>
+                <w:szCs w:val="19"/>
+              </w:rPr>
+              <w:t xml:space="preserve">Our model of how agents top up today; not a published upay policy</w:t>
+            </w:r>
+          </w:p>
+        </w:tc>
+      </w:tr>
+      <w:tr>
+        <w:tc>
+          <w:tcPr>
+            <w:tcW w:type="dxa" w:w="3300"/>
+            <w:tcBorders>
+              <w:top w:val="single" w:color="D9D7D0" w:sz="4"/>
+              <w:left w:val="single" w:color="D9D7D0" w:sz="4"/>
+              <w:bottom w:val="single" w:color="D9D7D0" w:sz="4"/>
+              <w:right w:val="single" w:color="D9D7D0" w:sz="4"/>
+            </w:tcBorders>
+            <w:tcMar>
+              <w:top w:type="dxa" w:w="70"/>
+              <w:left w:type="dxa" w:w="110"/>
+              <w:bottom w:type="dxa" w:w="70"/>
+              <w:right w:type="dxa" w:w="110"/>
+            </w:tcMar>
+          </w:tcPr>
+          <w:p>
+            <w:pPr>
+              <w:jc w:val="left"/>
+            </w:pPr>
+            <w:r>
+              <w:rPr>
+                <w:sz w:val="19"/>
+                <w:szCs w:val="19"/>
+              </w:rPr>
+              <w:t xml:space="preserve">Customer leaves after a failed cash-out</w:t>
+            </w:r>
+          </w:p>
+        </w:tc>
+        <w:tc>
+          <w:tcPr>
+            <w:tcW w:type="dxa" w:w="2500"/>
+            <w:tcBorders>
+              <w:top w:val="single" w:color="D9D7D0" w:sz="4"/>
+              <w:left w:val="single" w:color="D9D7D0" w:sz="4"/>
+              <w:bottom w:val="single" w:color="D9D7D0" w:sz="4"/>
+              <w:right w:val="single" w:color="D9D7D0" w:sz="4"/>
+            </w:tcBorders>
+            <w:tcMar>
+              <w:top w:type="dxa" w:w="70"/>
+              <w:left w:type="dxa" w:w="110"/>
+              <w:bottom w:type="dxa" w:w="70"/>
+              <w:right w:type="dxa" w:w="110"/>
+            </w:tcMar>
+          </w:tcPr>
+          <w:p>
+            <w:pPr>
+              <w:jc w:val="left"/>
+            </w:pPr>
+            <w:r>
+              <w:rPr>
+                <w:sz w:val="19"/>
+                <w:szCs w:val="19"/>
+              </w:rPr>
+              <w:t xml:space="preserve">5%</w:t>
+            </w:r>
+          </w:p>
+        </w:tc>
+        <w:tc>
+          <w:tcPr>
+            <w:tcW w:type="dxa" w:w="3226"/>
+            <w:tcBorders>
+              <w:top w:val="single" w:color="D9D7D0" w:sz="4"/>
+              <w:left w:val="single" w:color="D9D7D0" w:sz="4"/>
+              <w:bottom w:val="single" w:color="D9D7D0" w:sz="4"/>
+              <w:right w:val="single" w:color="D9D7D0" w:sz="4"/>
+            </w:tcBorders>
+            <w:tcMar>
+              <w:top w:type="dxa" w:w="70"/>
+              <w:left w:type="dxa" w:w="110"/>
+              <w:bottom w:type="dxa" w:w="70"/>
+              <w:right w:type="dxa" w:w="110"/>
+            </w:tcMar>
+          </w:tcPr>
+          <w:p>
+            <w:pPr>
+              <w:jc w:val="left"/>
+            </w:pPr>
+            <w:r>
+              <w:rPr>
+                <w:sz w:val="19"/>
+                <w:szCs w:val="19"/>
+              </w:rPr>
+              <w:t xml:space="preserve">Chosen by us, not sourced; drives 'customers kept'</w:t>
+            </w:r>
+          </w:p>
+        </w:tc>
+      </w:tr>
+      <w:tr>
+        <w:tc>
+          <w:tcPr>
+            <w:tcW w:type="dxa" w:w="3300"/>
+            <w:tcBorders>
+              <w:top w:val="single" w:color="D9D7D0" w:sz="4"/>
+              <w:left w:val="single" w:color="D9D7D0" w:sz="4"/>
+              <w:bottom w:val="single" w:color="D9D7D0" w:sz="4"/>
+              <w:right w:val="single" w:color="D9D7D0" w:sz="4"/>
+            </w:tcBorders>
+            <w:shd w:fill="F7F7F5" w:color="auto" w:val="clear"/>
+            <w:tcMar>
+              <w:top w:type="dxa" w:w="70"/>
+              <w:left w:type="dxa" w:w="110"/>
+              <w:bottom w:type="dxa" w:w="70"/>
+              <w:right w:type="dxa" w:w="110"/>
+            </w:tcMar>
+          </w:tcPr>
+          <w:p>
+            <w:pPr>
+              <w:jc w:val="left"/>
+            </w:pPr>
+            <w:r>
+              <w:rPr>
+                <w:sz w:val="19"/>
+                <w:szCs w:val="19"/>
+              </w:rPr>
+              <w:t xml:space="preserve">Opportunity cost of idle cash</w:t>
+            </w:r>
+          </w:p>
+        </w:tc>
+        <w:tc>
+          <w:tcPr>
+            <w:tcW w:type="dxa" w:w="2500"/>
+            <w:tcBorders>
+              <w:top w:val="single" w:color="D9D7D0" w:sz="4"/>
+              <w:left w:val="single" w:color="D9D7D0" w:sz="4"/>
+              <w:bottom w:val="single" w:color="D9D7D0" w:sz="4"/>
+              <w:right w:val="single" w:color="D9D7D0" w:sz="4"/>
+            </w:tcBorders>
+            <w:shd w:fill="F7F7F5" w:color="auto" w:val="clear"/>
+            <w:tcMar>
+              <w:top w:type="dxa" w:w="70"/>
+              <w:left w:type="dxa" w:w="110"/>
+              <w:bottom w:type="dxa" w:w="70"/>
+              <w:right w:type="dxa" w:w="110"/>
+            </w:tcMar>
+          </w:tcPr>
+          <w:p>
+            <w:pPr>
+              <w:jc w:val="left"/>
+            </w:pPr>
+            <w:r>
+              <w:rPr>
+                <w:sz w:val="19"/>
+                <w:szCs w:val="19"/>
+              </w:rPr>
+              <w:t xml:space="preserve">10% a year</w:t>
+            </w:r>
+          </w:p>
+        </w:tc>
+        <w:tc>
+          <w:tcPr>
+            <w:tcW w:type="dxa" w:w="3226"/>
+            <w:tcBorders>
+              <w:top w:val="single" w:color="D9D7D0" w:sz="4"/>
+              <w:left w:val="single" w:color="D9D7D0" w:sz="4"/>
+              <w:bottom w:val="single" w:color="D9D7D0" w:sz="4"/>
+              <w:right w:val="single" w:color="D9D7D0" w:sz="4"/>
+            </w:tcBorders>
+            <w:shd w:fill="F7F7F5" w:color="auto" w:val="clear"/>
+            <w:tcMar>
+              <w:top w:type="dxa" w:w="70"/>
+              <w:left w:type="dxa" w:w="110"/>
+              <w:bottom w:type="dxa" w:w="70"/>
+              <w:right w:type="dxa" w:w="110"/>
+            </w:tcMar>
+          </w:tcPr>
+          <w:p>
+            <w:pPr>
+              <w:jc w:val="left"/>
+            </w:pPr>
+            <w:r>
+              <w:rPr>
+                <w:sz w:val="19"/>
+                <w:szCs w:val="19"/>
+              </w:rPr>
+              <w:t xml:space="preserve">Round figure chosen by us, not sourced; drives the idle-cash cost</w:t>
+            </w:r>
+          </w:p>
+        </w:tc>
+      </w:tr>
+      <w:tr>
+        <w:tc>
+          <w:tcPr>
+            <w:tcW w:type="dxa" w:w="3300"/>
+            <w:tcBorders>
+              <w:top w:val="single" w:color="D9D7D0" w:sz="4"/>
+              <w:left w:val="single" w:color="D9D7D0" w:sz="4"/>
+              <w:bottom w:val="single" w:color="D9D7D0" w:sz="4"/>
+              <w:right w:val="single" w:color="D9D7D0" w:sz="4"/>
+            </w:tcBorders>
+            <w:tcMar>
+              <w:top w:type="dxa" w:w="70"/>
+              <w:left w:type="dxa" w:w="110"/>
+              <w:bottom w:type="dxa" w:w="70"/>
+              <w:right w:type="dxa" w:w="110"/>
+            </w:tcMar>
+          </w:tcPr>
+          <w:p>
+            <w:pPr>
+              <w:jc w:val="left"/>
+            </w:pPr>
+            <w:r>
+              <w:rPr>
+                <w:sz w:val="19"/>
+                <w:szCs w:val="19"/>
+              </w:rPr>
+              <w:t xml:space="preserve">Allowance (G2P) payment days</w:t>
+            </w:r>
+          </w:p>
+        </w:tc>
+        <w:tc>
+          <w:tcPr>
+            <w:tcW w:type="dxa" w:w="2500"/>
+            <w:tcBorders>
+              <w:top w:val="single" w:color="D9D7D0" w:sz="4"/>
+              <w:left w:val="single" w:color="D9D7D0" w:sz="4"/>
+              <w:bottom w:val="single" w:color="D9D7D0" w:sz="4"/>
+              <w:right w:val="single" w:color="D9D7D0" w:sz="4"/>
+            </w:tcBorders>
+            <w:tcMar>
+              <w:top w:type="dxa" w:w="70"/>
+              <w:left w:type="dxa" w:w="110"/>
+              <w:bottom w:type="dxa" w:w="70"/>
+              <w:right w:type="dxa" w:w="110"/>
+            </w:tcMar>
+          </w:tcPr>
+          <w:p>
+            <w:pPr>
+              <w:jc w:val="left"/>
+            </w:pPr>
+            <w:r>
+              <w:rPr>
+                <w:sz w:val="19"/>
+                <w:szCs w:val="19"/>
+              </w:rPr>
+              <w:t xml:space="preserve">Synthetic quarterly schedule</w:t>
+            </w:r>
+          </w:p>
+        </w:tc>
+        <w:tc>
+          <w:tcPr>
+            <w:tcW w:type="dxa" w:w="3226"/>
+            <w:tcBorders>
+              <w:top w:val="single" w:color="D9D7D0" w:sz="4"/>
+              <w:left w:val="single" w:color="D9D7D0" w:sz="4"/>
+              <w:bottom w:val="single" w:color="D9D7D0" w:sz="4"/>
+              <w:right w:val="single" w:color="D9D7D0" w:sz="4"/>
+            </w:tcBorders>
+            <w:tcMar>
+              <w:top w:type="dxa" w:w="70"/>
+              <w:left w:type="dxa" w:w="110"/>
+              <w:bottom w:type="dxa" w:w="70"/>
+              <w:right w:type="dxa" w:w="110"/>
+            </w:tcMar>
+          </w:tcPr>
+          <w:p>
+            <w:pPr>
+              <w:jc w:val="left"/>
+            </w:pPr>
+            <w:r>
+              <w:rPr>
+                <w:sz w:val="19"/>
+                <w:szCs w:val="19"/>
+              </w:rPr>
+              <w:t xml:space="preserve">Real schedules vary by programme</w:t>
+            </w:r>
+          </w:p>
+        </w:tc>
+      </w:tr>
+    </w:tbl>
+    <w:p>
+      <w:pPr>
+        <w:spacing w:after="60"/>
+      </w:pPr>
+    </w:p>
+    <w:p>
+      <w:pPr>
+        <w:pStyle w:val="Heading2"/>
+      </w:pPr>
+      <w:r>
+        <w:t xml:space="preserve">15.3 Results</w:t>
+      </w:r>
+    </w:p>
+    <w:tbl>
+      <w:tblPr>
+        <w:tblW w:type="dxa" w:w="9026"/>
+        <w:tblBorders>
+          <w:top w:val="single" w:color="auto" w:sz="4"/>
+          <w:left w:val="single" w:color="auto" w:sz="4"/>
+          <w:bottom w:val="single" w:color="auto" w:sz="4"/>
+          <w:right w:val="single" w:color="auto" w:sz="4"/>
+          <w:insideH w:val="single" w:color="auto" w:sz="4"/>
+          <w:insideV w:val="single" w:color="auto" w:sz="4"/>
+        </w:tblBorders>
+      </w:tblPr>
+      <w:tblGrid>
+        <w:gridCol w:w="3300"/>
+        <w:gridCol w:w="1700"/>
+        <w:gridCol w:w="4026"/>
+      </w:tblGrid>
+      <w:tr>
+        <w:trPr>
+          <w:tblHeader/>
+        </w:trPr>
+        <w:tc>
+          <w:tcPr>
+            <w:tcW w:type="dxa" w:w="3300"/>
+            <w:tcBorders>
+              <w:top w:val="single" w:color="D9D7D0" w:sz="4"/>
+              <w:left w:val="single" w:color="D9D7D0" w:sz="4"/>
+              <w:bottom w:val="single" w:color="D9D7D0" w:sz="4"/>
+              <w:right w:val="single" w:color="D9D7D0" w:sz="4"/>
+            </w:tcBorders>
+            <w:shd w:fill="1F3B57" w:color="auto" w:val="clear"/>
+            <w:tcMar>
+              <w:top w:type="dxa" w:w="70"/>
+              <w:left w:type="dxa" w:w="110"/>
+              <w:bottom w:type="dxa" w:w="70"/>
+              <w:right w:type="dxa" w:w="110"/>
+            </w:tcMar>
+          </w:tcPr>
+          <w:p>
+            <w:pPr>
+              <w:jc w:val="left"/>
+            </w:pPr>
+            <w:r>
+              <w:rPr>
+                <w:b/>
+                <w:bCs/>
+                <w:color w:val="FFFFFF"/>
+                <w:sz w:val="19"/>
+                <w:szCs w:val="19"/>
+              </w:rPr>
+              <w:t xml:space="preserve">Claim</w:t>
+            </w:r>
+          </w:p>
+        </w:tc>
+        <w:tc>
+          <w:tcPr>
+            <w:tcW w:type="dxa" w:w="1700"/>
+            <w:tcBorders>
+              <w:top w:val="single" w:color="D9D7D0" w:sz="4"/>
+              <w:left w:val="single" w:color="D9D7D0" w:sz="4"/>
+              <w:bottom w:val="single" w:color="D9D7D0" w:sz="4"/>
+              <w:right w:val="single" w:color="D9D7D0" w:sz="4"/>
+            </w:tcBorders>
+            <w:shd w:fill="1F3B57" w:color="auto" w:val="clear"/>
+            <w:tcMar>
+              <w:top w:type="dxa" w:w="70"/>
+              <w:left w:type="dxa" w:w="110"/>
+              <w:bottom w:type="dxa" w:w="70"/>
+              <w:right w:type="dxa" w:w="110"/>
+            </w:tcMar>
+          </w:tcPr>
+          <w:p>
+            <w:pPr>
+              <w:jc w:val="left"/>
+            </w:pPr>
+            <w:r>
+              <w:rPr>
+                <w:b/>
+                <w:bCs/>
+                <w:color w:val="FFFFFF"/>
+                <w:sz w:val="19"/>
+                <w:szCs w:val="19"/>
+              </w:rPr>
+              <w:t xml:space="preserve">Status</w:t>
+            </w:r>
+          </w:p>
+        </w:tc>
+        <w:tc>
+          <w:tcPr>
+            <w:tcW w:type="dxa" w:w="4026"/>
+            <w:tcBorders>
+              <w:top w:val="single" w:color="D9D7D0" w:sz="4"/>
+              <w:left w:val="single" w:color="D9D7D0" w:sz="4"/>
+              <w:bottom w:val="single" w:color="D9D7D0" w:sz="4"/>
+              <w:right w:val="single" w:color="D9D7D0" w:sz="4"/>
+            </w:tcBorders>
+            <w:shd w:fill="1F3B57" w:color="auto" w:val="clear"/>
+            <w:tcMar>
+              <w:top w:type="dxa" w:w="70"/>
+              <w:left w:type="dxa" w:w="110"/>
+              <w:bottom w:type="dxa" w:w="70"/>
+              <w:right w:type="dxa" w:w="110"/>
+            </w:tcMar>
+          </w:tcPr>
+          <w:p>
+            <w:pPr>
+              <w:jc w:val="left"/>
+            </w:pPr>
+            <w:r>
+              <w:rPr>
+                <w:b/>
+                <w:bCs/>
+                <w:color w:val="FFFFFF"/>
+                <w:sz w:val="19"/>
+                <w:szCs w:val="19"/>
+              </w:rPr>
+              <w:t xml:space="preserve">Evidence</w:t>
+            </w:r>
+          </w:p>
+        </w:tc>
+      </w:tr>
+      <w:tr>
+        <w:tc>
+          <w:tcPr>
+            <w:tcW w:type="dxa" w:w="3300"/>
+            <w:tcBorders>
+              <w:top w:val="single" w:color="D9D7D0" w:sz="4"/>
+              <w:left w:val="single" w:color="D9D7D0" w:sz="4"/>
+              <w:bottom w:val="single" w:color="D9D7D0" w:sz="4"/>
+              <w:right w:val="single" w:color="D9D7D0" w:sz="4"/>
+            </w:tcBorders>
+            <w:tcMar>
+              <w:top w:type="dxa" w:w="70"/>
+              <w:left w:type="dxa" w:w="110"/>
+              <w:bottom w:type="dxa" w:w="70"/>
+              <w:right w:type="dxa" w:w="110"/>
+            </w:tcMar>
+          </w:tcPr>
+          <w:p>
+            <w:pPr>
+              <w:jc w:val="left"/>
+            </w:pPr>
+            <w:r>
+              <w:rPr>
+                <w:sz w:val="19"/>
+                <w:szCs w:val="19"/>
+              </w:rPr>
+              <w:t xml:space="preserve">Forecast error 53% lower overall and 64% lower on event days than same day last week</w:t>
+            </w:r>
+          </w:p>
+        </w:tc>
+        <w:tc>
+          <w:tcPr>
+            <w:tcW w:type="dxa" w:w="1700"/>
+            <w:tcBorders>
+              <w:top w:val="single" w:color="D9D7D0" w:sz="4"/>
+              <w:left w:val="single" w:color="D9D7D0" w:sz="4"/>
+              <w:bottom w:val="single" w:color="D9D7D0" w:sz="4"/>
+              <w:right w:val="single" w:color="D9D7D0" w:sz="4"/>
+            </w:tcBorders>
+            <w:tcMar>
+              <w:top w:type="dxa" w:w="70"/>
+              <w:left w:type="dxa" w:w="110"/>
+              <w:bottom w:type="dxa" w:w="70"/>
+              <w:right w:type="dxa" w:w="110"/>
+            </w:tcMar>
+          </w:tcPr>
+          <w:p>
+            <w:pPr>
+              <w:jc w:val="left"/>
+            </w:pPr>
+            <w:r>
+              <w:rPr>
+                <w:sz w:val="19"/>
+                <w:szCs w:val="19"/>
+              </w:rPr>
+              <w:t xml:space="preserve">Verified (our code)</w:t>
+            </w:r>
+          </w:p>
+        </w:tc>
+        <w:tc>
+          <w:tcPr>
+            <w:tcW w:type="dxa" w:w="4026"/>
+            <w:tcBorders>
+              <w:top w:val="single" w:color="D9D7D0" w:sz="4"/>
+              <w:left w:val="single" w:color="D9D7D0" w:sz="4"/>
+              <w:bottom w:val="single" w:color="D9D7D0" w:sz="4"/>
+              <w:right w:val="single" w:color="D9D7D0" w:sz="4"/>
+            </w:tcBorders>
+            <w:tcMar>
+              <w:top w:type="dxa" w:w="70"/>
+              <w:left w:type="dxa" w:w="110"/>
+              <w:bottom w:type="dxa" w:w="70"/>
+              <w:right w:type="dxa" w:w="110"/>
+            </w:tcMar>
+          </w:tcPr>
+          <w:p>
+            <w:pPr>
+              <w:jc w:val="left"/>
+            </w:pPr>
+            <w:r>
+              <w:rPr>
+                <w:sz w:val="19"/>
+                <w:szCs w:val="19"/>
+              </w:rPr>
+              <w:t xml:space="preserve">artifacts/metrics.json; 89 automated tests; leakage test</w:t>
+            </w:r>
+          </w:p>
+        </w:tc>
+      </w:tr>
+      <w:tr>
+        <w:tc>
+          <w:tcPr>
+            <w:tcW w:type="dxa" w:w="3300"/>
+            <w:tcBorders>
+              <w:top w:val="single" w:color="D9D7D0" w:sz="4"/>
+              <w:left w:val="single" w:color="D9D7D0" w:sz="4"/>
+              <w:bottom w:val="single" w:color="D9D7D0" w:sz="4"/>
+              <w:right w:val="single" w:color="D9D7D0" w:sz="4"/>
+            </w:tcBorders>
+            <w:shd w:fill="F7F7F5" w:color="auto" w:val="clear"/>
+            <w:tcMar>
+              <w:top w:type="dxa" w:w="70"/>
+              <w:left w:type="dxa" w:w="110"/>
+              <w:bottom w:type="dxa" w:w="70"/>
+              <w:right w:type="dxa" w:w="110"/>
+            </w:tcMar>
+          </w:tcPr>
+          <w:p>
+            <w:pPr>
+              <w:jc w:val="left"/>
+            </w:pPr>
+            <w:r>
+              <w:rPr>
+                <w:sz w:val="19"/>
+                <w:szCs w:val="19"/>
+              </w:rPr>
+              <w:t xml:space="preserve">Stockouts −47.5%, failed cash-out value −46.7%, upay fee lost −53.7%, cash +2.3%, trips +4.1%</w:t>
+            </w:r>
+          </w:p>
+        </w:tc>
+        <w:tc>
+          <w:tcPr>
+            <w:tcW w:type="dxa" w:w="1700"/>
+            <w:tcBorders>
+              <w:top w:val="single" w:color="D9D7D0" w:sz="4"/>
+              <w:left w:val="single" w:color="D9D7D0" w:sz="4"/>
+              <w:bottom w:val="single" w:color="D9D7D0" w:sz="4"/>
+              <w:right w:val="single" w:color="D9D7D0" w:sz="4"/>
+            </w:tcBorders>
+            <w:shd w:fill="F7F7F5" w:color="auto" w:val="clear"/>
+            <w:tcMar>
+              <w:top w:type="dxa" w:w="70"/>
+              <w:left w:type="dxa" w:w="110"/>
+              <w:bottom w:type="dxa" w:w="70"/>
+              <w:right w:type="dxa" w:w="110"/>
+            </w:tcMar>
+          </w:tcPr>
+          <w:p>
+            <w:pPr>
+              <w:jc w:val="left"/>
+            </w:pPr>
+            <w:r>
+              <w:rPr>
+                <w:sz w:val="19"/>
+                <w:szCs w:val="19"/>
+              </w:rPr>
+              <w:t xml:space="preserve">Verified (our code)</w:t>
+            </w:r>
+          </w:p>
+        </w:tc>
+        <w:tc>
+          <w:tcPr>
+            <w:tcW w:type="dxa" w:w="4026"/>
+            <w:tcBorders>
+              <w:top w:val="single" w:color="D9D7D0" w:sz="4"/>
+              <w:left w:val="single" w:color="D9D7D0" w:sz="4"/>
+              <w:bottom w:val="single" w:color="D9D7D0" w:sz="4"/>
+              <w:right w:val="single" w:color="D9D7D0" w:sz="4"/>
+            </w:tcBorders>
+            <w:shd w:fill="F7F7F5" w:color="auto" w:val="clear"/>
+            <w:tcMar>
+              <w:top w:type="dxa" w:w="70"/>
+              <w:left w:type="dxa" w:w="110"/>
+              <w:bottom w:type="dxa" w:w="70"/>
+              <w:right w:type="dxa" w:w="110"/>
+            </w:tcMar>
+          </w:tcPr>
+          <w:p>
+            <w:pPr>
+              <w:jc w:val="left"/>
+            </w:pPr>
+            <w:r>
+              <w:rPr>
+                <w:sz w:val="19"/>
+                <w:szCs w:val="19"/>
+              </w:rPr>
+              <w:t xml:space="preserve">artifacts/simulation_default.json; test period never used for tuning</w:t>
+            </w:r>
+          </w:p>
+        </w:tc>
+      </w:tr>
+      <w:tr>
+        <w:tc>
+          <w:tcPr>
+            <w:tcW w:type="dxa" w:w="3300"/>
+            <w:tcBorders>
+              <w:top w:val="single" w:color="D9D7D0" w:sz="4"/>
+              <w:left w:val="single" w:color="D9D7D0" w:sz="4"/>
+              <w:bottom w:val="single" w:color="D9D7D0" w:sz="4"/>
+              <w:right w:val="single" w:color="D9D7D0" w:sz="4"/>
+            </w:tcBorders>
+            <w:tcMar>
+              <w:top w:type="dxa" w:w="70"/>
+              <w:left w:type="dxa" w:w="110"/>
+              <w:bottom w:type="dxa" w:w="70"/>
+              <w:right w:type="dxa" w:w="110"/>
+            </w:tcMar>
+          </w:tcPr>
+          <w:p>
+            <w:pPr>
+              <w:jc w:val="left"/>
+            </w:pPr>
+            <w:r>
+              <w:rPr>
+                <w:sz w:val="19"/>
+                <w:szCs w:val="19"/>
+              </w:rPr>
+              <w:t xml:space="preserve">Every area type and rural/urban improve</w:t>
+            </w:r>
+          </w:p>
+        </w:tc>
+        <w:tc>
+          <w:tcPr>
+            <w:tcW w:type="dxa" w:w="1700"/>
+            <w:tcBorders>
+              <w:top w:val="single" w:color="D9D7D0" w:sz="4"/>
+              <w:left w:val="single" w:color="D9D7D0" w:sz="4"/>
+              <w:bottom w:val="single" w:color="D9D7D0" w:sz="4"/>
+              <w:right w:val="single" w:color="D9D7D0" w:sz="4"/>
+            </w:tcBorders>
+            <w:tcMar>
+              <w:top w:type="dxa" w:w="70"/>
+              <w:left w:type="dxa" w:w="110"/>
+              <w:bottom w:type="dxa" w:w="70"/>
+              <w:right w:type="dxa" w:w="110"/>
+            </w:tcMar>
+          </w:tcPr>
+          <w:p>
+            <w:pPr>
+              <w:jc w:val="left"/>
+            </w:pPr>
+            <w:r>
+              <w:rPr>
+                <w:sz w:val="19"/>
+                <w:szCs w:val="19"/>
+              </w:rPr>
+              <w:t xml:space="preserve">Verified (our code)</w:t>
+            </w:r>
+          </w:p>
+        </w:tc>
+        <w:tc>
+          <w:tcPr>
+            <w:tcW w:type="dxa" w:w="4026"/>
+            <w:tcBorders>
+              <w:top w:val="single" w:color="D9D7D0" w:sz="4"/>
+              <w:left w:val="single" w:color="D9D7D0" w:sz="4"/>
+              <w:bottom w:val="single" w:color="D9D7D0" w:sz="4"/>
+              <w:right w:val="single" w:color="D9D7D0" w:sz="4"/>
+            </w:tcBorders>
+            <w:tcMar>
+              <w:top w:type="dxa" w:w="70"/>
+              <w:left w:type="dxa" w:w="110"/>
+              <w:bottom w:type="dxa" w:w="70"/>
+              <w:right w:type="dxa" w:w="110"/>
+            </w:tcMar>
+          </w:tcPr>
+          <w:p>
+            <w:pPr>
+              <w:jc w:val="left"/>
+            </w:pPr>
+            <w:r>
+              <w:rPr>
+                <w:sz w:val="19"/>
+                <w:szCs w:val="19"/>
+              </w:rPr>
+              <w:t xml:space="preserve">artifacts/fairness.json</w:t>
+            </w:r>
+          </w:p>
+        </w:tc>
+      </w:tr>
+      <w:tr>
+        <w:tc>
+          <w:tcPr>
+            <w:tcW w:type="dxa" w:w="3300"/>
+            <w:tcBorders>
+              <w:top w:val="single" w:color="D9D7D0" w:sz="4"/>
+              <w:left w:val="single" w:color="D9D7D0" w:sz="4"/>
+              <w:bottom w:val="single" w:color="D9D7D0" w:sz="4"/>
+              <w:right w:val="single" w:color="D9D7D0" w:sz="4"/>
+            </w:tcBorders>
+            <w:shd w:fill="F7F7F5" w:color="auto" w:val="clear"/>
+            <w:tcMar>
+              <w:top w:type="dxa" w:w="70"/>
+              <w:left w:type="dxa" w:w="110"/>
+              <w:bottom w:type="dxa" w:w="70"/>
+              <w:right w:type="dxa" w:w="110"/>
+            </w:tcMar>
+          </w:tcPr>
+          <w:p>
+            <w:pPr>
+              <w:jc w:val="left"/>
+            </w:pPr>
+            <w:r>
+              <w:rPr>
+                <w:sz w:val="19"/>
+                <w:szCs w:val="19"/>
+              </w:rPr>
+              <w:t xml:space="preserve">About Tk 9.3 crore a month of upay fees recovered at network scale</w:t>
+            </w:r>
+          </w:p>
+        </w:tc>
+        <w:tc>
+          <w:tcPr>
+            <w:tcW w:type="dxa" w:w="1700"/>
+            <w:tcBorders>
+              <w:top w:val="single" w:color="D9D7D0" w:sz="4"/>
+              <w:left w:val="single" w:color="D9D7D0" w:sz="4"/>
+              <w:bottom w:val="single" w:color="D9D7D0" w:sz="4"/>
+              <w:right w:val="single" w:color="D9D7D0" w:sz="4"/>
+            </w:tcBorders>
+            <w:shd w:fill="F7F7F5" w:color="auto" w:val="clear"/>
+            <w:tcMar>
+              <w:top w:type="dxa" w:w="70"/>
+              <w:left w:type="dxa" w:w="110"/>
+              <w:bottom w:type="dxa" w:w="70"/>
+              <w:right w:type="dxa" w:w="110"/>
+            </w:tcMar>
+          </w:tcPr>
+          <w:p>
+            <w:pPr>
+              <w:jc w:val="left"/>
+            </w:pPr>
+            <w:r>
+              <w:rPr>
+                <w:sz w:val="19"/>
+                <w:szCs w:val="19"/>
+              </w:rPr>
+              <w:t xml:space="preserve">Derived</w:t>
+            </w:r>
+          </w:p>
+        </w:tc>
+        <w:tc>
+          <w:tcPr>
+            <w:tcW w:type="dxa" w:w="4026"/>
+            <w:tcBorders>
+              <w:top w:val="single" w:color="D9D7D0" w:sz="4"/>
+              <w:left w:val="single" w:color="D9D7D0" w:sz="4"/>
+              <w:bottom w:val="single" w:color="D9D7D0" w:sz="4"/>
+              <w:right w:val="single" w:color="D9D7D0" w:sz="4"/>
+            </w:tcBorders>
+            <w:shd w:fill="F7F7F5" w:color="auto" w:val="clear"/>
+            <w:tcMar>
+              <w:top w:type="dxa" w:w="70"/>
+              <w:left w:type="dxa" w:w="110"/>
+              <w:bottom w:type="dxa" w:w="70"/>
+              <w:right w:type="dxa" w:w="110"/>
+            </w:tcMar>
+          </w:tcPr>
+          <w:p>
+            <w:pPr>
+              <w:jc w:val="left"/>
+            </w:pPr>
+            <w:r>
+              <w:rPr>
+                <w:sz w:val="19"/>
+                <w:szCs w:val="19"/>
+              </w:rPr>
+              <w:t xml:space="preserve">Synthetic per-agent result × public agent count [7] × public fees [8] × unconfirmed commission rate. An estimate of the opportunity, not a forecast of upay revenue</w:t>
+            </w:r>
+          </w:p>
+        </w:tc>
+      </w:tr>
+      <w:tr>
+        <w:tc>
+          <w:tcPr>
+            <w:tcW w:type="dxa" w:w="3300"/>
+            <w:tcBorders>
+              <w:top w:val="single" w:color="D9D7D0" w:sz="4"/>
+              <w:left w:val="single" w:color="D9D7D0" w:sz="4"/>
+              <w:bottom w:val="single" w:color="D9D7D0" w:sz="4"/>
+              <w:right w:val="single" w:color="D9D7D0" w:sz="4"/>
+            </w:tcBorders>
+            <w:tcMar>
+              <w:top w:type="dxa" w:w="70"/>
+              <w:left w:type="dxa" w:w="110"/>
+              <w:bottom w:type="dxa" w:w="70"/>
+              <w:right w:type="dxa" w:w="110"/>
+            </w:tcMar>
+          </w:tcPr>
+          <w:p>
+            <w:pPr>
+              <w:jc w:val="left"/>
+            </w:pPr>
+            <w:r>
+              <w:rPr>
+                <w:sz w:val="19"/>
+                <w:szCs w:val="19"/>
+              </w:rPr>
+              <w:t xml:space="preserve">Tk 6.4 crore commission, 1.69 lakh stockout-days, 2.7 lakh customers kept per month</w:t>
+            </w:r>
+          </w:p>
+        </w:tc>
+        <w:tc>
+          <w:tcPr>
+            <w:tcW w:type="dxa" w:w="1700"/>
+            <w:tcBorders>
+              <w:top w:val="single" w:color="D9D7D0" w:sz="4"/>
+              <w:left w:val="single" w:color="D9D7D0" w:sz="4"/>
+              <w:bottom w:val="single" w:color="D9D7D0" w:sz="4"/>
+              <w:right w:val="single" w:color="D9D7D0" w:sz="4"/>
+            </w:tcBorders>
+            <w:tcMar>
+              <w:top w:type="dxa" w:w="70"/>
+              <w:left w:type="dxa" w:w="110"/>
+              <w:bottom w:type="dxa" w:w="70"/>
+              <w:right w:type="dxa" w:w="110"/>
+            </w:tcMar>
+          </w:tcPr>
+          <w:p>
+            <w:pPr>
+              <w:jc w:val="left"/>
+            </w:pPr>
+            <w:r>
+              <w:rPr>
+                <w:sz w:val="19"/>
+                <w:szCs w:val="19"/>
+              </w:rPr>
+              <w:t xml:space="preserve">Derived</w:t>
+            </w:r>
+          </w:p>
+        </w:tc>
+        <w:tc>
+          <w:tcPr>
+            <w:tcW w:type="dxa" w:w="4026"/>
+            <w:tcBorders>
+              <w:top w:val="single" w:color="D9D7D0" w:sz="4"/>
+              <w:left w:val="single" w:color="D9D7D0" w:sz="4"/>
+              <w:bottom w:val="single" w:color="D9D7D0" w:sz="4"/>
+              <w:right w:val="single" w:color="D9D7D0" w:sz="4"/>
+            </w:tcBorders>
+            <w:tcMar>
+              <w:top w:type="dxa" w:w="70"/>
+              <w:left w:type="dxa" w:w="110"/>
+              <w:bottom w:type="dxa" w:w="70"/>
+              <w:right w:type="dxa" w:w="110"/>
+            </w:tcMar>
+          </w:tcPr>
+          <w:p>
+            <w:pPr>
+              <w:jc w:val="left"/>
+            </w:pPr>
+            <w:r>
+              <w:rPr>
+                <w:sz w:val="19"/>
+                <w:szCs w:val="19"/>
+              </w:rPr>
+              <w:t xml:space="preserve">Same scaling; 'customers kept' also depends on the 5% churn assumption</w:t>
+            </w:r>
+          </w:p>
+        </w:tc>
+      </w:tr>
+      <w:tr>
+        <w:tc>
+          <w:tcPr>
+            <w:tcW w:type="dxa" w:w="3300"/>
+            <w:tcBorders>
+              <w:top w:val="single" w:color="D9D7D0" w:sz="4"/>
+              <w:left w:val="single" w:color="D9D7D0" w:sz="4"/>
+              <w:bottom w:val="single" w:color="D9D7D0" w:sz="4"/>
+              <w:right w:val="single" w:color="D9D7D0" w:sz="4"/>
+            </w:tcBorders>
+            <w:shd w:fill="F7F7F5" w:color="auto" w:val="clear"/>
+            <w:tcMar>
+              <w:top w:type="dxa" w:w="70"/>
+              <w:left w:type="dxa" w:w="110"/>
+              <w:bottom w:type="dxa" w:w="70"/>
+              <w:right w:type="dxa" w:w="110"/>
+            </w:tcMar>
+          </w:tcPr>
+          <w:p>
+            <w:pPr>
+              <w:jc w:val="left"/>
+            </w:pPr>
+            <w:r>
+              <w:rPr>
+                <w:sz w:val="19"/>
+                <w:szCs w:val="19"/>
+              </w:rPr>
+              <w:t xml:space="preserve">Reproducible build, 89 tests, CI green on Linux and Windows, API responses under 300 ms</w:t>
+            </w:r>
+          </w:p>
+        </w:tc>
+        <w:tc>
+          <w:tcPr>
+            <w:tcW w:type="dxa" w:w="1700"/>
+            <w:tcBorders>
+              <w:top w:val="single" w:color="D9D7D0" w:sz="4"/>
+              <w:left w:val="single" w:color="D9D7D0" w:sz="4"/>
+              <w:bottom w:val="single" w:color="D9D7D0" w:sz="4"/>
+              <w:right w:val="single" w:color="D9D7D0" w:sz="4"/>
+            </w:tcBorders>
+            <w:shd w:fill="F7F7F5" w:color="auto" w:val="clear"/>
+            <w:tcMar>
+              <w:top w:type="dxa" w:w="70"/>
+              <w:left w:type="dxa" w:w="110"/>
+              <w:bottom w:type="dxa" w:w="70"/>
+              <w:right w:type="dxa" w:w="110"/>
+            </w:tcMar>
+          </w:tcPr>
+          <w:p>
+            <w:pPr>
+              <w:jc w:val="left"/>
+            </w:pPr>
+            <w:r>
+              <w:rPr>
+                <w:sz w:val="19"/>
+                <w:szCs w:val="19"/>
+              </w:rPr>
+              <w:t xml:space="preserve">Verified (our code)</w:t>
+            </w:r>
+          </w:p>
+        </w:tc>
+        <w:tc>
+          <w:tcPr>
+            <w:tcW w:type="dxa" w:w="4026"/>
+            <w:tcBorders>
+              <w:top w:val="single" w:color="D9D7D0" w:sz="4"/>
+              <w:left w:val="single" w:color="D9D7D0" w:sz="4"/>
+              <w:bottom w:val="single" w:color="D9D7D0" w:sz="4"/>
+              <w:right w:val="single" w:color="D9D7D0" w:sz="4"/>
+            </w:tcBorders>
+            <w:shd w:fill="F7F7F5" w:color="auto" w:val="clear"/>
+            <w:tcMar>
+              <w:top w:type="dxa" w:w="70"/>
+              <w:left w:type="dxa" w:w="110"/>
+              <w:bottom w:type="dxa" w:w="70"/>
+              <w:right w:type="dxa" w:w="110"/>
+            </w:tcMar>
+          </w:tcPr>
+          <w:p>
+            <w:pPr>
+              <w:jc w:val="left"/>
+            </w:pPr>
+            <w:r>
+              <w:rPr>
+                <w:sz w:val="19"/>
+                <w:szCs w:val="19"/>
+              </w:rPr>
+              <w:t xml:space="preserve">GitHub Actions; fresh-clone rebuild; browser walk-through</w:t>
+            </w:r>
+          </w:p>
+        </w:tc>
+      </w:tr>
+    </w:tbl>
+    <w:p>
+      <w:pPr>
+        <w:spacing w:after="60"/>
+      </w:pPr>
+    </w:p>
+    <w:tbl>
+      <w:tblPr>
+        <w:tblW w:type="dxa" w:w="9026"/>
+        <w:tblBorders>
+          <w:top w:val="single" w:color="auto" w:sz="4"/>
+          <w:left w:val="single" w:color="auto" w:sz="4"/>
+          <w:bottom w:val="single" w:color="auto" w:sz="4"/>
+          <w:right w:val="single" w:color="auto" w:sz="4"/>
+          <w:insideH w:val="single" w:color="auto" w:sz="4"/>
+          <w:insideV w:val="single" w:color="auto" w:sz="4"/>
+        </w:tblBorders>
+      </w:tblPr>
+      <w:tblGrid>
+        <w:gridCol w:w="9026"/>
+      </w:tblGrid>
+      <w:tr>
+        <w:trPr>
+          <w:cantSplit/>
+        </w:trPr>
+        <w:tc>
+          <w:tcPr>
+            <w:tcW w:type="dxa" w:w="9026"/>
+            <w:tcBorders>
+              <w:top w:val="single" w:color="FDF3EE" w:sz="4"/>
+              <w:left w:val="single" w:color="EB6834" w:sz="24"/>
+              <w:bottom w:val="single" w:color="FDF3EE" w:sz="4"/>
+              <w:right w:val="single" w:color="FDF3EE" w:sz="4"/>
+            </w:tcBorders>
+            <w:shd w:fill="FDF3EE" w:color="auto" w:val="clear"/>
+            <w:tcMar>
+              <w:top w:type="dxa" w:w="140"/>
+              <w:left w:type="dxa" w:w="220"/>
+              <w:bottom w:type="dxa" w:w="140"/>
+              <w:right w:type="dxa" w:w="220"/>
+            </w:tcMar>
+          </w:tcPr>
+          <w:p>
+            <w:pPr>
+              <w:spacing w:after="60" w:line="276"/>
+            </w:pPr>
+            <w:r>
+              <w:rPr>
+                <w:b/>
+                <w:bCs/>
+              </w:rPr>
+              <w:t xml:space="preserve">What would turn our results into validated results:</w:t>
+            </w:r>
+            <w:r>
+              <w:t xml:space="preserve"> a shadow-mode run on one distributor's anonymised daily agent balances, comparing FloatWise's recommendations with what actually happened (Section 14.2). Until then, every result in this report should be read as evidence that the method works on realistic synthetic data.</w:t>
             </w:r>
           </w:p>
         </w:tc>
@@ -17564,6 +21553,361 @@
         </w:tc>
       </w:tr>
     </w:tbl>
+    <w:p>
+      <w:pPr>
+        <w:pStyle w:val="Heading1"/>
+        <w:pageBreakBefore/>
+      </w:pPr>
+      <w:r>
+        <w:t xml:space="preserve">Appendix C. References</w:t>
+      </w:r>
+    </w:p>
+    <w:p>
+      <w:pPr>
+        <w:spacing w:after="120" w:line="288"/>
+      </w:pPr>
+      <w:r>
+        <w:t xml:space="preserve">All sources were opened and checked on 3 October 2026. Quotations are taken from the articles.</w:t>
+      </w:r>
+    </w:p>
+    <w:p>
+      <w:pPr>
+        <w:spacing w:after="100" w:line="276"/>
+        <w:ind w:left="480" w:hanging="480"/>
+      </w:pPr>
+      <w:r>
+        <w:rPr>
+          <w:b/>
+          <w:bCs/>
+        </w:rPr>
+        <w:t xml:space="preserve">[1]  </w:t>
+      </w:r>
+      <w:r>
+        <w:t xml:space="preserve">Prothom Alo. “Bank closed for Eid holidays, how to withdraw cash”. 16 March 2026. </w:t>
+      </w:r>
+      <w:hyperlink w:history="1" r:id="rIdqofdlw6qdg6uzek-b7xkt">
+        <w:r>
+          <w:rPr>
+            <w:rStyle w:val="Hyperlink"/>
+            <w:sz w:val="17"/>
+            <w:szCs w:val="17"/>
+          </w:rPr>
+          <w:t xml:space="preserve">https://en.prothomalo.com/business/local/kmk5b0q6na</w:t>
+        </w:r>
+      </w:hyperlink>
+    </w:p>
+    <w:p>
+      <w:pPr>
+        <w:spacing w:after="100" w:line="276"/>
+        <w:ind w:left="480" w:hanging="480"/>
+      </w:pPr>
+      <w:r>
+        <w:rPr>
+          <w:b/>
+          <w:bCs/>
+        </w:rPr>
+        <w:t xml:space="preserve">[2]  </w:t>
+      </w:r>
+      <w:r>
+        <w:t xml:space="preserve">Prothom Alo. “Remittances near $3b mark, set new record before Eid”. 27 March 2025. </w:t>
+      </w:r>
+      <w:hyperlink w:history="1" r:id="rId8po9ipdj32g7dfwewtctt">
+        <w:r>
+          <w:rPr>
+            <w:rStyle w:val="Hyperlink"/>
+            <w:sz w:val="17"/>
+            <w:szCs w:val="17"/>
+          </w:rPr>
+          <w:t xml:space="preserve">https://en.prothomalo.com/business/local/3fq2rb78vb</w:t>
+        </w:r>
+      </w:hyperlink>
+    </w:p>
+    <w:p>
+      <w:pPr>
+        <w:spacing w:after="100" w:line="276"/>
+        <w:ind w:left="480" w:hanging="480"/>
+      </w:pPr>
+      <w:r>
+        <w:rPr>
+          <w:b/>
+          <w:bCs/>
+        </w:rPr>
+        <w:t xml:space="preserve">[3]  </w:t>
+      </w:r>
+      <w:r>
+        <w:t xml:space="preserve">The Business Standard. “Bangladesh receives record $3.29b in remittances in March”. 6 April 2025. </w:t>
+      </w:r>
+      <w:hyperlink w:history="1" r:id="rIdtlkkw5bferf--p1xneplf">
+        <w:r>
+          <w:rPr>
+            <w:rStyle w:val="Hyperlink"/>
+            <w:sz w:val="17"/>
+            <w:szCs w:val="17"/>
+          </w:rPr>
+          <w:t xml:space="preserve">https://www.tbsnews.net/economy/bangladesh-receives-record-329-billion-remittances-march-1109181</w:t>
+        </w:r>
+      </w:hyperlink>
+    </w:p>
+    <w:p>
+      <w:pPr>
+        <w:spacing w:after="100" w:line="276"/>
+        <w:ind w:left="480" w:hanging="480"/>
+      </w:pPr>
+      <w:r>
+        <w:rPr>
+          <w:b/>
+          <w:bCs/>
+        </w:rPr>
+        <w:t xml:space="preserve">[4]  </w:t>
+      </w:r>
+      <w:r>
+        <w:t xml:space="preserve">The Daily Star. “MFS transactions hit record Tk 1.25 lakh crore in April”. 2023. </w:t>
+      </w:r>
+      <w:hyperlink w:history="1" r:id="rId69axfclmvyuuaswtrxhg1">
+        <w:r>
+          <w:rPr>
+            <w:rStyle w:val="Hyperlink"/>
+            <w:sz w:val="17"/>
+            <w:szCs w:val="17"/>
+          </w:rPr>
+          <w:t xml:space="preserve">https://www.thedailystar.net/business/economy/news/mfs-transactions-hit-record-tk-125-lakh-crore-april-3352691</w:t>
+        </w:r>
+      </w:hyperlink>
+    </w:p>
+    <w:p>
+      <w:pPr>
+        <w:spacing w:after="100" w:line="276"/>
+        <w:ind w:left="480" w:hanging="480"/>
+      </w:pPr>
+      <w:r>
+        <w:rPr>
+          <w:b/>
+          <w:bCs/>
+        </w:rPr>
+        <w:t xml:space="preserve">[5]  </w:t>
+      </w:r>
+      <w:r>
+        <w:t xml:space="preserve">The Business Standard. “Cash supply to banks falls short ahead of Eid amid note shortages”. 16 May 2026. </w:t>
+      </w:r>
+      <w:hyperlink w:history="1" r:id="rIdukfcy9qmspzlcejz0ho6x">
+        <w:r>
+          <w:rPr>
+            <w:rStyle w:val="Hyperlink"/>
+            <w:sz w:val="17"/>
+            <w:szCs w:val="17"/>
+          </w:rPr>
+          <w:t xml:space="preserve">https://www.tbsnews.net/economy/cash-supply-banks-falls-short-ahead-eid-amid-note-shortages-1441006</w:t>
+        </w:r>
+      </w:hyperlink>
+    </w:p>
+    <w:p>
+      <w:pPr>
+        <w:spacing w:after="100" w:line="276"/>
+        <w:ind w:left="480" w:hanging="480"/>
+      </w:pPr>
+      <w:r>
+        <w:rPr>
+          <w:b/>
+          <w:bCs/>
+        </w:rPr>
+        <w:t xml:space="preserve">[6]  </w:t>
+      </w:r>
+      <w:r>
+        <w:t xml:space="preserve">The Business Standard. “MFS reduces RMG workers' payment hassle”. 16 March 2021. </w:t>
+      </w:r>
+      <w:hyperlink w:history="1" r:id="rIdqrfgioplkhqvm619df4a2">
+        <w:r>
+          <w:rPr>
+            <w:rStyle w:val="Hyperlink"/>
+            <w:sz w:val="17"/>
+            <w:szCs w:val="17"/>
+          </w:rPr>
+          <w:t xml:space="preserve">https://www.tbsnews.net/economy/mfs-reduces-rmg-workers-payment-hassle-217591</w:t>
+        </w:r>
+      </w:hyperlink>
+    </w:p>
+    <w:p>
+      <w:pPr>
+        <w:spacing w:after="100" w:line="276"/>
+        <w:ind w:left="480" w:hanging="480"/>
+      </w:pPr>
+      <w:r>
+        <w:rPr>
+          <w:b/>
+          <w:bCs/>
+        </w:rPr>
+        <w:t xml:space="preserve">[7]  </w:t>
+      </w:r>
+      <w:r>
+        <w:t xml:space="preserve">The Business Standard. “upay's accumulated losses cross Tk300cr in 2023”. 15 June 2024. </w:t>
+      </w:r>
+      <w:hyperlink w:history="1" r:id="rIdiebplnzwvoodoj8dlepnf">
+        <w:r>
+          <w:rPr>
+            <w:rStyle w:val="Hyperlink"/>
+            <w:sz w:val="17"/>
+            <w:szCs w:val="17"/>
+          </w:rPr>
+          <w:t xml:space="preserve">https://www.tbsnews.net/economy/stocks/upays-accumulated-losses-cross-tk300cr-2023-877946</w:t>
+        </w:r>
+      </w:hyperlink>
+    </w:p>
+    <w:p>
+      <w:pPr>
+        <w:spacing w:after="100" w:line="276"/>
+        <w:ind w:left="480" w:hanging="480"/>
+      </w:pPr>
+      <w:r>
+        <w:rPr>
+          <w:b/>
+          <w:bCs/>
+        </w:rPr>
+        <w:t xml:space="preserve">[8]  </w:t>
+      </w:r>
+      <w:r>
+        <w:t xml:space="preserve">upay. “Cash-out charges by wallet (upaybd.com)”. accessed 3 October 2026. </w:t>
+      </w:r>
+      <w:hyperlink w:history="1" r:id="rId1povhrj_jqtzzf_szmpcf">
+        <w:r>
+          <w:rPr>
+            <w:rStyle w:val="Hyperlink"/>
+            <w:sz w:val="17"/>
+            <w:szCs w:val="17"/>
+          </w:rPr>
+          <w:t xml:space="preserve">https://www.upaybd.com/services/details/upay-agent</w:t>
+        </w:r>
+      </w:hyperlink>
+    </w:p>
+    <w:p>
+      <w:pPr>
+        <w:spacing w:after="100" w:line="276"/>
+        <w:ind w:left="480" w:hanging="480"/>
+      </w:pPr>
+      <w:r>
+        <w:rPr>
+          <w:b/>
+          <w:bCs/>
+        </w:rPr>
+        <w:t xml:space="preserve">[9]  </w:t>
+      </w:r>
+      <w:r>
+        <w:t xml:space="preserve">The Financial Express. “'upay' offers lowest cash out charge in mobile money transactions”. 22 April 2021. </w:t>
+      </w:r>
+      <w:hyperlink w:history="1" r:id="rId5bwtm0bmb9zysq9bxhxsy">
+        <w:r>
+          <w:rPr>
+            <w:rStyle w:val="Hyperlink"/>
+            <w:sz w:val="17"/>
+            <w:szCs w:val="17"/>
+          </w:rPr>
+          <w:t xml:space="preserve">https://today.thefinancialexpress.com.bd/stock-corporate/upay-offers-lowest-cash-out-charge-in-mobile-money-transactions-1619026261</w:t>
+        </w:r>
+      </w:hyperlink>
+    </w:p>
+    <w:p>
+      <w:pPr>
+        <w:spacing w:after="100" w:line="276"/>
+        <w:ind w:left="480" w:hanging="480"/>
+      </w:pPr>
+      <w:r>
+        <w:rPr>
+          <w:b/>
+          <w:bCs/>
+        </w:rPr>
+        <w:t xml:space="preserve">[10]  </w:t>
+      </w:r>
+      <w:r>
+        <w:t xml:space="preserve">The Business Standard. “Majority of government allowance recipients opt for Nagad in FY26”. 5 November 2025. </w:t>
+      </w:r>
+      <w:hyperlink w:history="1" r:id="rIdn46zwi-wv1sw1swhobh-5">
+        <w:r>
+          <w:rPr>
+            <w:rStyle w:val="Hyperlink"/>
+            <w:sz w:val="17"/>
+            <w:szCs w:val="17"/>
+          </w:rPr>
+          <w:t xml:space="preserve">https://www.tbsnews.net/economy/corporates/majority-government-allowance-recipients-opt-nagad-fy26-1278111</w:t>
+        </w:r>
+      </w:hyperlink>
+    </w:p>
+    <w:p>
+      <w:pPr>
+        <w:spacing w:after="100" w:line="276"/>
+        <w:ind w:left="480" w:hanging="480"/>
+      </w:pPr>
+      <w:r>
+        <w:rPr>
+          <w:b/>
+          <w:bCs/>
+        </w:rPr>
+        <w:t xml:space="preserve">[11]  </w:t>
+      </w:r>
+      <w:r>
+        <w:t xml:space="preserve">IFC / World Bank. “Liquidity Management for Mobile Money Providers (IFC Mobile Money Toolkit)”. World Bank Documents. </w:t>
+      </w:r>
+      <w:hyperlink w:history="1" r:id="rIdzcpqao1rxnqrdioy1v58r">
+        <w:r>
+          <w:rPr>
+            <w:rStyle w:val="Hyperlink"/>
+            <w:sz w:val="17"/>
+            <w:szCs w:val="17"/>
+          </w:rPr>
+          <w:t xml:space="preserve">https://documents1.worldbank.org/curated/en/802221501150875893/pdf/117459-WP-Tool-10-5-Liquidity-Management-Series-IFC-mobile-money-toolkit-PUBLIC.pdf</w:t>
+        </w:r>
+      </w:hyperlink>
+    </w:p>
+    <w:p>
+      <w:pPr>
+        <w:spacing w:after="100" w:line="276"/>
+        <w:ind w:left="480" w:hanging="480"/>
+      </w:pPr>
+      <w:r>
+        <w:rPr>
+          <w:b/>
+          <w:bCs/>
+        </w:rPr>
+        <w:t xml:space="preserve">[12]  </w:t>
+      </w:r>
+      <w:r>
+        <w:t xml:space="preserve">The Daily Star. “Bangladesh to celebrate Eid-ul-Fitr on March 21”. March 2026. </w:t>
+      </w:r>
+      <w:hyperlink w:history="1" r:id="rIdo2mgp78u5jmlcs5ttcubg">
+        <w:r>
+          <w:rPr>
+            <w:rStyle w:val="Hyperlink"/>
+            <w:sz w:val="17"/>
+            <w:szCs w:val="17"/>
+          </w:rPr>
+          <w:t xml:space="preserve">https://www.thedailystar.net/news/bangladesh/news/bangladesh-celebrate-eid-ul-fitr-march-21-4132701</w:t>
+        </w:r>
+      </w:hyperlink>
+    </w:p>
+    <w:p>
+      <w:pPr>
+        <w:spacing w:after="100" w:line="276"/>
+        <w:ind w:left="480" w:hanging="480"/>
+      </w:pPr>
+      <w:r>
+        <w:rPr>
+          <w:b/>
+          <w:bCs/>
+        </w:rPr>
+        <w:t xml:space="preserve">[13]  </w:t>
+      </w:r>
+      <w:r>
+        <w:t xml:space="preserve">Prothom Alo. “Eid-ul-Azha on 28 May as moon sighted”. 18 May 2026. </w:t>
+      </w:r>
+      <w:hyperlink w:history="1" r:id="rIdxnfneazj5hw-l0v3bydfv">
+        <w:r>
+          <w:rPr>
+            <w:rStyle w:val="Hyperlink"/>
+            <w:sz w:val="17"/>
+            <w:szCs w:val="17"/>
+          </w:rPr>
+          <w:t xml:space="preserve">https://en.prothomalo.com/bangladesh/vdn1tkv26i</w:t>
+        </w:r>
+      </w:hyperlink>
+    </w:p>
     <w:sectPr>
       <w:headerReference w:type="default" r:id="rId7"/>
       <w:footerReference w:type="default" r:id="rId8"/>

</xml_diff>